<commit_message>
build: add Monolog dependency and update Composer lock file
</commit_message>
<xml_diff>
--- a/lab-a/AI2-LA-gr432-woźniak-jakub.docx
+++ b/lab-a/AI2-LA-gr432-woźniak-jakub.docx
@@ -7,7 +7,7 @@
         <w:tblStyle w:val="Tabela-Siatka"/>
         <w:tblW w:w="10456" w:type="dxa"/>
         <w:jc w:val="start"/>
-        <w:tblInd w:w="0" w:type="dxa"/>
+        <w:tblInd w:w="113" w:type="dxa"/>
         <w:tblLayout w:type="fixed"/>
         <w:tblCellMar>
           <w:top w:w="0" w:type="dxa"/>
@@ -18,8 +18,8 @@
         <w:tblLook w:val="04a0" w:firstRow="1" w:noVBand="1" w:lastRow="0" w:firstColumn="1" w:lastColumn="0" w:noHBand="0"/>
       </w:tblPr>
       <w:tblGrid>
-        <w:gridCol w:w="1694"/>
-        <w:gridCol w:w="4255"/>
+        <w:gridCol w:w="1693"/>
+        <w:gridCol w:w="4256"/>
         <w:gridCol w:w="4507"/>
       </w:tblGrid>
       <w:tr>
@@ -28,7 +28,7 @@
         </w:trPr>
         <w:tc>
           <w:tcPr>
-            <w:tcW w:w="1694" w:type="dxa"/>
+            <w:tcW w:w="1693" w:type="dxa"/>
             <w:vMerge w:val="restart"/>
             <w:tcBorders>
               <w:top w:val="single" w:sz="4" w:space="0" w:color="D9D9D9"/>
@@ -116,7 +116,7 @@
         </w:tc>
         <w:tc>
           <w:tcPr>
-            <w:tcW w:w="4255" w:type="dxa"/>
+            <w:tcW w:w="4256" w:type="dxa"/>
             <w:vMerge w:val="restart"/>
             <w:tcBorders>
               <w:top w:val="single" w:sz="4" w:space="0" w:color="D9D9D9"/>
@@ -500,7 +500,7 @@
         </w:trPr>
         <w:tc>
           <w:tcPr>
-            <w:tcW w:w="1694" w:type="dxa"/>
+            <w:tcW w:w="1693" w:type="dxa"/>
             <w:vMerge w:val="continue"/>
             <w:tcBorders>
               <w:top w:val="single" w:sz="4" w:space="0" w:color="D9D9D9"/>
@@ -539,7 +539,7 @@
         </w:tc>
         <w:tc>
           <w:tcPr>
-            <w:tcW w:w="4255" w:type="dxa"/>
+            <w:tcW w:w="4256" w:type="dxa"/>
             <w:vMerge w:val="continue"/>
             <w:tcBorders>
               <w:top w:val="single" w:sz="4" w:space="0" w:color="D9D9D9"/>
@@ -607,7 +607,7 @@
         </w:trPr>
         <w:tc>
           <w:tcPr>
-            <w:tcW w:w="1694" w:type="dxa"/>
+            <w:tcW w:w="1693" w:type="dxa"/>
             <w:tcBorders>
               <w:top w:val="single" w:sz="4" w:space="0" w:color="D9D9D9"/>
               <w:start w:val="single" w:sz="4" w:space="0" w:color="D9D9D9"/>
@@ -693,7 +693,7 @@
         </w:tc>
         <w:tc>
           <w:tcPr>
-            <w:tcW w:w="4255" w:type="dxa"/>
+            <w:tcW w:w="4256" w:type="dxa"/>
             <w:vMerge w:val="continue"/>
             <w:tcBorders>
               <w:top w:val="single" w:sz="4" w:space="0" w:color="D9D9D9"/>
@@ -2662,7 +2662,7 @@
         <w:tblStyle w:val="Tabela-Siatka"/>
         <w:tblW w:w="5000" w:type="pct"/>
         <w:jc w:val="start"/>
-        <w:tblInd w:w="0" w:type="dxa"/>
+        <w:tblInd w:w="113" w:type="dxa"/>
         <w:tblLayout w:type="fixed"/>
         <w:tblCellMar>
           <w:top w:w="0" w:type="dxa"/>
@@ -2673,8 +2673,8 @@
         <w:tblLook w:val="04a0" w:firstRow="1" w:noVBand="1" w:lastRow="0" w:firstColumn="1" w:lastColumn="0" w:noHBand="0"/>
       </w:tblPr>
       <w:tblGrid>
-        <w:gridCol w:w="8194"/>
-        <w:gridCol w:w="1136"/>
+        <w:gridCol w:w="8193"/>
+        <w:gridCol w:w="1137"/>
         <w:gridCol w:w="1136"/>
       </w:tblGrid>
       <w:tr>
@@ -2683,7 +2683,7 @@
         </w:trPr>
         <w:tc>
           <w:tcPr>
-            <w:tcW w:w="8194" w:type="dxa"/>
+            <w:tcW w:w="8193" w:type="dxa"/>
             <w:tcBorders/>
             <w:vAlign w:val="center"/>
           </w:tcPr>
@@ -2716,7 +2716,7 @@
         </w:tc>
         <w:tc>
           <w:tcPr>
-            <w:tcW w:w="1136" w:type="dxa"/>
+            <w:tcW w:w="1137" w:type="dxa"/>
             <w:tcBorders/>
             <w:vAlign w:val="center"/>
           </w:tcPr>
@@ -3394,7 +3394,11 @@
         </w:rPr>
       </w:pPr>
       <w:r>
-        <w:rPr/>
+        <w:rPr>
+          <w:rFonts w:asciiTheme="minorHAnsi" w:hAnsiTheme="minorHAnsi"/>
+          <w:shd w:fill="auto" w:val="clear"/>
+          <w:lang w:val="en-US"/>
+        </w:rPr>
         <w:drawing>
           <wp:anchor distT="0" distB="0" distL="0" distR="0" simplePos="0" relativeHeight="13" behindDoc="0" locked="0" layoutInCell="0" allowOverlap="1">
             <wp:simplePos x="0" y="0"/>
@@ -3462,7 +3466,7 @@
         <w:tblStyle w:val="Tabela-Siatka"/>
         <w:tblW w:w="5000" w:type="pct"/>
         <w:jc w:val="start"/>
-        <w:tblInd w:w="0" w:type="dxa"/>
+        <w:tblInd w:w="113" w:type="dxa"/>
         <w:tblLayout w:type="fixed"/>
         <w:tblCellMar>
           <w:top w:w="0" w:type="dxa"/>
@@ -3473,8 +3477,8 @@
         <w:tblLook w:val="04a0" w:firstRow="1" w:noVBand="1" w:lastRow="0" w:firstColumn="1" w:lastColumn="0" w:noHBand="0"/>
       </w:tblPr>
       <w:tblGrid>
-        <w:gridCol w:w="8194"/>
-        <w:gridCol w:w="1136"/>
+        <w:gridCol w:w="8193"/>
+        <w:gridCol w:w="1137"/>
         <w:gridCol w:w="1136"/>
       </w:tblGrid>
       <w:tr>
@@ -3483,7 +3487,7 @@
         </w:trPr>
         <w:tc>
           <w:tcPr>
-            <w:tcW w:w="8194" w:type="dxa"/>
+            <w:tcW w:w="8193" w:type="dxa"/>
             <w:tcBorders/>
             <w:vAlign w:val="center"/>
           </w:tcPr>
@@ -3516,7 +3520,7 @@
         </w:tc>
         <w:tc>
           <w:tcPr>
-            <w:tcW w:w="1136" w:type="dxa"/>
+            <w:tcW w:w="1137" w:type="dxa"/>
             <w:tcBorders/>
             <w:vAlign w:val="center"/>
           </w:tcPr>
@@ -4309,7 +4313,7 @@
         <w:tblStyle w:val="Tabela-Siatka"/>
         <w:tblW w:w="5000" w:type="pct"/>
         <w:jc w:val="start"/>
-        <w:tblInd w:w="0" w:type="dxa"/>
+        <w:tblInd w:w="113" w:type="dxa"/>
         <w:tblLayout w:type="fixed"/>
         <w:tblCellMar>
           <w:top w:w="0" w:type="dxa"/>
@@ -4320,8 +4324,8 @@
         <w:tblLook w:val="04a0" w:firstRow="1" w:noVBand="1" w:lastRow="0" w:firstColumn="1" w:lastColumn="0" w:noHBand="0"/>
       </w:tblPr>
       <w:tblGrid>
-        <w:gridCol w:w="8194"/>
-        <w:gridCol w:w="1136"/>
+        <w:gridCol w:w="8193"/>
+        <w:gridCol w:w="1137"/>
         <w:gridCol w:w="1136"/>
       </w:tblGrid>
       <w:tr>
@@ -4330,7 +4334,7 @@
         </w:trPr>
         <w:tc>
           <w:tcPr>
-            <w:tcW w:w="8194" w:type="dxa"/>
+            <w:tcW w:w="8193" w:type="dxa"/>
             <w:tcBorders/>
             <w:vAlign w:val="center"/>
           </w:tcPr>
@@ -4363,7 +4367,7 @@
         </w:tc>
         <w:tc>
           <w:tcPr>
-            <w:tcW w:w="1136" w:type="dxa"/>
+            <w:tcW w:w="1137" w:type="dxa"/>
             <w:tcBorders/>
             <w:vAlign w:val="center"/>
           </w:tcPr>
@@ -4891,11 +4895,7 @@
       </w:pPr>
       <w:r>
         <w:rPr/>
-        <w:t>…</w:t>
-      </w:r>
-      <w:r>
-        <w:rPr/>
-        <w:t>omówienie…</w:t>
+        <w:t>Do pliku composer.json została dodana tablica z zależnościami instalowanymi poleceniem php composer.phar install.</w:t>
       </w:r>
     </w:p>
     <w:p>
@@ -5064,7 +5064,7 @@
         <w:tblStyle w:val="Tabela-Siatka"/>
         <w:tblW w:w="5000" w:type="pct"/>
         <w:jc w:val="start"/>
-        <w:tblInd w:w="0" w:type="dxa"/>
+        <w:tblInd w:w="113" w:type="dxa"/>
         <w:tblLayout w:type="fixed"/>
         <w:tblCellMar>
           <w:top w:w="0" w:type="dxa"/>
@@ -5075,8 +5075,8 @@
         <w:tblLook w:val="04a0" w:firstRow="1" w:noVBand="1" w:lastRow="0" w:firstColumn="1" w:lastColumn="0" w:noHBand="0"/>
       </w:tblPr>
       <w:tblGrid>
-        <w:gridCol w:w="8194"/>
-        <w:gridCol w:w="1136"/>
+        <w:gridCol w:w="8193"/>
+        <w:gridCol w:w="1137"/>
         <w:gridCol w:w="1136"/>
       </w:tblGrid>
       <w:tr>
@@ -5085,7 +5085,7 @@
         </w:trPr>
         <w:tc>
           <w:tcPr>
-            <w:tcW w:w="8194" w:type="dxa"/>
+            <w:tcW w:w="8193" w:type="dxa"/>
             <w:tcBorders/>
             <w:vAlign w:val="center"/>
           </w:tcPr>
@@ -5113,6 +5113,39 @@
                 <w:lang w:eastAsia="en-US" w:bidi="ar-SA"/>
               </w:rPr>
               <w:t>Punkty:</w:t>
+            </w:r>
+          </w:p>
+        </w:tc>
+        <w:tc>
+          <w:tcPr>
+            <w:tcW w:w="1137" w:type="dxa"/>
+            <w:tcBorders/>
+            <w:vAlign w:val="center"/>
+          </w:tcPr>
+          <w:p>
+            <w:pPr>
+              <w:pStyle w:val="PunktyTabela"/>
+              <w:widowControl/>
+              <w:suppressAutoHyphens w:val="true"/>
+              <w:spacing w:before="0" w:after="0"/>
+              <w:jc w:val="center"/>
+              <w:rPr>
+                <w:rFonts w:ascii="Calibri" w:hAnsi="Calibri" w:eastAsia="Calibri" w:cs="Arial"/>
+                <w:kern w:val="2"/>
+                <w:sz w:val="22"/>
+                <w:szCs w:val="22"/>
+                <w:lang w:eastAsia="en-US" w:bidi="ar-SA"/>
+              </w:rPr>
+            </w:pPr>
+            <w:r>
+              <w:rPr>
+                <w:rFonts w:eastAsia="Calibri" w:cs="Arial"/>
+                <w:kern w:val="2"/>
+                <w:sz w:val="22"/>
+                <w:szCs w:val="22"/>
+                <w:lang w:eastAsia="en-US" w:bidi="ar-SA"/>
+              </w:rPr>
+              <w:t>0</w:t>
             </w:r>
           </w:p>
         </w:tc>
@@ -5145,6 +5178,593 @@
                 <w:szCs w:val="22"/>
                 <w:lang w:eastAsia="en-US" w:bidi="ar-SA"/>
               </w:rPr>
+              <w:t>1</w:t>
+            </w:r>
+          </w:p>
+        </w:tc>
+      </w:tr>
+    </w:tbl>
+    <w:p>
+      <w:pPr>
+        <w:pStyle w:val="Heading1"/>
+        <w:rPr/>
+      </w:pPr>
+      <w:bookmarkStart w:id="8" w:name="_Toc240323090"/>
+      <w:r>
+        <w:rPr/>
+        <w:t>Wykorzystanie różnych poziomów logowania Monolog</w:t>
+      </w:r>
+      <w:bookmarkEnd w:id="8"/>
+    </w:p>
+    <w:p>
+      <w:pPr>
+        <w:pStyle w:val="Normal"/>
+        <w:rPr>
+          <w:lang w:val="pl-PL"/>
+        </w:rPr>
+      </w:pPr>
+      <w:r>
+        <w:rPr>
+          <w:lang w:val="pl-PL"/>
+        </w:rPr>
+        <w:t xml:space="preserve">W tej części wykorzystamy bibliotekę monolog do logowania komunikatów i błędów. Zmodyfikuj kod </w:t>
+      </w:r>
+      <w:r>
+        <w:rPr>
+          <w:rStyle w:val="inline-code"/>
+        </w:rPr>
+        <w:t>index.php</w:t>
+      </w:r>
+      <w:r>
+        <w:rPr>
+          <w:lang w:val="pl-PL"/>
+        </w:rPr>
+        <w:t xml:space="preserve">, żeby dodać logowanie do pliku </w:t>
+      </w:r>
+      <w:r>
+        <w:rPr>
+          <w:rStyle w:val="inline-code"/>
+        </w:rPr>
+        <w:t>monolog.log</w:t>
+      </w:r>
+      <w:r>
+        <w:rPr>
+          <w:lang w:val="pl-PL"/>
+        </w:rPr>
+        <w:t>:</w:t>
+      </w:r>
+    </w:p>
+    <w:p>
+      <w:pPr>
+        <w:pStyle w:val="block-code"/>
+        <w:rPr>
+          <w:lang w:val="en-US"/>
+        </w:rPr>
+      </w:pPr>
+      <w:r>
+        <w:rPr>
+          <w:lang w:val="en-US"/>
+        </w:rPr>
+        <w:t>&lt;?php // index.php</w:t>
+      </w:r>
+    </w:p>
+    <w:p>
+      <w:pPr>
+        <w:pStyle w:val="block-code"/>
+        <w:rPr>
+          <w:lang w:val="en-US"/>
+        </w:rPr>
+      </w:pPr>
+      <w:r>
+        <w:rPr>
+          <w:lang w:val="en-US"/>
+        </w:rPr>
+        <w:t>require_once __DIR__ . '/vendor/autoload.php';</w:t>
+      </w:r>
+    </w:p>
+    <w:p>
+      <w:pPr>
+        <w:pStyle w:val="block-code"/>
+        <w:rPr>
+          <w:lang w:val="en-US"/>
+        </w:rPr>
+      </w:pPr>
+      <w:r>
+        <w:rPr>
+          <w:lang w:val="en-US"/>
+        </w:rPr>
+      </w:r>
+    </w:p>
+    <w:p>
+      <w:pPr>
+        <w:pStyle w:val="block-code"/>
+        <w:rPr>
+          <w:color w:themeColor="text1" w:themeTint="f2" w:val="0D0D0D"/>
+          <w:lang w:val="en-US"/>
+        </w:rPr>
+      </w:pPr>
+      <w:r>
+        <w:rPr>
+          <w:color w:themeColor="text1" w:themeTint="f2" w:val="0D0D0D"/>
+          <w:lang w:val="en-US"/>
+        </w:rPr>
+        <w:t>$ds = DIRECTORY_SEPARATOR;</w:t>
+      </w:r>
+    </w:p>
+    <w:p>
+      <w:pPr>
+        <w:pStyle w:val="block-code"/>
+        <w:rPr>
+          <w:color w:themeColor="text1" w:themeTint="f2" w:val="0D0D0D"/>
+          <w:lang w:val="en-US"/>
+        </w:rPr>
+      </w:pPr>
+      <w:r>
+        <w:rPr>
+          <w:color w:themeColor="text1" w:themeTint="f2" w:val="0D0D0D"/>
+          <w:lang w:val="en-US"/>
+        </w:rPr>
+        <w:t>$log = new \Monolog\Logger("my_log");</w:t>
+      </w:r>
+    </w:p>
+    <w:p>
+      <w:pPr>
+        <w:pStyle w:val="block-code"/>
+        <w:rPr>
+          <w:color w:themeColor="text1" w:themeTint="f2" w:val="0D0D0D"/>
+          <w:lang w:val="es-ES"/>
+        </w:rPr>
+      </w:pPr>
+      <w:r>
+        <w:rPr>
+          <w:color w:themeColor="text1" w:themeTint="f2" w:val="0D0D0D"/>
+          <w:lang w:val="en-US"/>
+        </w:rPr>
+        <w:t xml:space="preserve">$log-&gt;pushHandler(new \Monolog\Handler\StreamHandler(__DIR__ . </w:t>
+      </w:r>
+      <w:r>
+        <w:rPr>
+          <w:color w:themeColor="text1" w:themeTint="f2" w:val="0D0D0D"/>
+          <w:lang w:val="es-ES"/>
+        </w:rPr>
+        <w:t>$ds . 'monolog.log', \Monolog\Level::</w:t>
+      </w:r>
+      <w:r>
+        <w:rPr>
+          <w:color w:themeColor="text1" w:themeTint="f2" w:val="0D0D0D"/>
+          <w:highlight w:val="green"/>
+          <w:lang w:val="es-ES"/>
+        </w:rPr>
+        <w:t>Error</w:t>
+      </w:r>
+      <w:r>
+        <w:rPr>
+          <w:color w:themeColor="text1" w:themeTint="f2" w:val="0D0D0D"/>
+          <w:lang w:val="es-ES"/>
+        </w:rPr>
+        <w:t>));</w:t>
+      </w:r>
+    </w:p>
+    <w:p>
+      <w:pPr>
+        <w:pStyle w:val="block-code"/>
+        <w:rPr>
+          <w:color w:themeColor="text1" w:themeTint="f2" w:val="0D0D0D"/>
+          <w:lang w:val="en-US"/>
+        </w:rPr>
+      </w:pPr>
+      <w:r>
+        <w:rPr>
+          <w:color w:themeColor="text1" w:themeTint="f2" w:val="0D0D0D"/>
+          <w:lang w:val="en-US"/>
+        </w:rPr>
+        <w:t>$log-&gt;error("This is some error.");</w:t>
+      </w:r>
+    </w:p>
+    <w:p>
+      <w:pPr>
+        <w:pStyle w:val="block-code"/>
+        <w:rPr>
+          <w:color w:themeColor="text1" w:themeTint="f2" w:val="0D0D0D"/>
+          <w:lang w:val="en-US"/>
+        </w:rPr>
+      </w:pPr>
+      <w:r>
+        <w:rPr>
+          <w:color w:themeColor="text1" w:themeTint="f2" w:val="0D0D0D"/>
+          <w:lang w:val="en-US"/>
+        </w:rPr>
+        <w:t>$log-&gt;warning("This is some warning.");</w:t>
+      </w:r>
+    </w:p>
+    <w:p>
+      <w:pPr>
+        <w:pStyle w:val="block-code"/>
+        <w:rPr>
+          <w:color w:themeColor="text1" w:themeTint="f2" w:val="0D0D0D"/>
+          <w:lang w:val="en-US"/>
+        </w:rPr>
+      </w:pPr>
+      <w:r>
+        <w:rPr>
+          <w:color w:themeColor="text1" w:themeTint="f2" w:val="0D0D0D"/>
+          <w:lang w:val="en-US"/>
+        </w:rPr>
+        <w:t>$log-&gt;notice("This is some notice.");</w:t>
+      </w:r>
+    </w:p>
+    <w:p>
+      <w:pPr>
+        <w:pStyle w:val="block-code"/>
+        <w:rPr>
+          <w:color w:themeColor="text1" w:themeTint="f2" w:val="0D0D0D"/>
+          <w:lang w:val="en-US"/>
+        </w:rPr>
+      </w:pPr>
+      <w:r>
+        <w:rPr>
+          <w:color w:themeColor="text1" w:themeTint="f2" w:val="0D0D0D"/>
+          <w:lang w:val="en-US"/>
+        </w:rPr>
+        <w:t>$log-&gt;info("This is some info.");</w:t>
+      </w:r>
+    </w:p>
+    <w:p>
+      <w:pPr>
+        <w:pStyle w:val="block-code"/>
+        <w:rPr>
+          <w:color w:themeColor="text1" w:themeTint="f2" w:val="0D0D0D"/>
+          <w:lang w:val="en-US"/>
+        </w:rPr>
+      </w:pPr>
+      <w:r>
+        <w:rPr>
+          <w:color w:themeColor="text1" w:themeTint="f2" w:val="0D0D0D"/>
+          <w:lang w:val="en-US"/>
+        </w:rPr>
+        <w:t>$log-&gt;debug("This is some debug.");</w:t>
+      </w:r>
+    </w:p>
+    <w:p>
+      <w:pPr>
+        <w:pStyle w:val="block-code"/>
+        <w:rPr>
+          <w:lang w:val="en-US"/>
+        </w:rPr>
+      </w:pPr>
+      <w:r>
+        <w:rPr>
+          <w:lang w:val="en-US"/>
+        </w:rPr>
+      </w:r>
+    </w:p>
+    <w:p>
+      <w:pPr>
+        <w:pStyle w:val="block-code"/>
+        <w:rPr>
+          <w:lang w:val="en-US"/>
+        </w:rPr>
+      </w:pPr>
+      <w:r>
+        <w:rPr>
+          <w:lang w:val="en-US"/>
+        </w:rPr>
+        <w:t>$duck = new \Akarczmarczyk\LabComposer\Duck();</w:t>
+      </w:r>
+    </w:p>
+    <w:p>
+      <w:pPr>
+        <w:pStyle w:val="block-code"/>
+        <w:rPr>
+          <w:lang w:val="en-US"/>
+        </w:rPr>
+      </w:pPr>
+      <w:r>
+        <w:rPr>
+          <w:lang w:val="en-US"/>
+        </w:rPr>
+        <w:t>$duck-&gt;quack();</w:t>
+      </w:r>
+    </w:p>
+    <w:p>
+      <w:pPr>
+        <w:pStyle w:val="block-code"/>
+        <w:rPr>
+          <w:lang w:val="en-US"/>
+        </w:rPr>
+      </w:pPr>
+      <w:r>
+        <w:rPr>
+          <w:lang w:val="en-US"/>
+        </w:rPr>
+        <w:t>$duck-&gt;quack();</w:t>
+      </w:r>
+    </w:p>
+    <w:p>
+      <w:pPr>
+        <w:pStyle w:val="block-code"/>
+        <w:rPr>
+          <w:lang w:val="en-US"/>
+        </w:rPr>
+      </w:pPr>
+      <w:r>
+        <w:rPr>
+          <w:lang w:val="en-US"/>
+        </w:rPr>
+        <w:t>$duck-&gt;quack();</w:t>
+      </w:r>
+    </w:p>
+    <w:p>
+      <w:pPr>
+        <w:pStyle w:val="Normal"/>
+        <w:rPr>
+          <w:lang w:val="pl-PL"/>
+        </w:rPr>
+      </w:pPr>
+      <w:r>
+        <w:rPr>
+          <w:lang w:val="pl-PL"/>
+        </w:rPr>
+        <w:t>Uruchom program:</w:t>
+      </w:r>
+    </w:p>
+    <w:p>
+      <w:pPr>
+        <w:pStyle w:val="block-code"/>
+        <w:rPr/>
+      </w:pPr>
+      <w:r>
+        <w:rPr/>
+        <w:t>php index.php</w:t>
+      </w:r>
+    </w:p>
+    <w:p>
+      <w:pPr>
+        <w:pStyle w:val="Normal"/>
+        <w:rPr>
+          <w:lang w:val="pl-PL"/>
+        </w:rPr>
+      </w:pPr>
+      <w:r>
+        <w:rPr>
+          <w:lang w:val="pl-PL"/>
+        </w:rPr>
+        <w:t xml:space="preserve">Sprawdź zawartość pliku </w:t>
+      </w:r>
+      <w:r>
+        <w:rPr>
+          <w:rStyle w:val="inline-code"/>
+        </w:rPr>
+        <w:t>monolog.log</w:t>
+      </w:r>
+      <w:r>
+        <w:rPr>
+          <w:lang w:val="pl-PL"/>
+        </w:rPr>
+        <w:t>.</w:t>
+      </w:r>
+    </w:p>
+    <w:p>
+      <w:pPr>
+        <w:pStyle w:val="Zadanie"/>
+        <w:rPr/>
+      </w:pPr>
+      <w:r>
+        <w:rPr/>
+        <w:t xml:space="preserve">Kolejno zmieniaj </w:t>
+      </w:r>
+      <w:r>
+        <w:rPr>
+          <w:rStyle w:val="inline-code"/>
+        </w:rPr>
+        <w:t>Error</w:t>
+      </w:r>
+      <w:r>
+        <w:rPr/>
+        <w:t xml:space="preserve"> w kodzie na </w:t>
+      </w:r>
+      <w:r>
+        <w:rPr>
+          <w:rStyle w:val="inline-code"/>
+        </w:rPr>
+        <w:t>Warning</w:t>
+      </w:r>
+      <w:r>
+        <w:rPr/>
+        <w:t xml:space="preserve">, </w:t>
+      </w:r>
+      <w:r>
+        <w:rPr>
+          <w:rStyle w:val="inline-code"/>
+        </w:rPr>
+        <w:t>Notice</w:t>
+      </w:r>
+      <w:r>
+        <w:rPr/>
+        <w:t xml:space="preserve">, </w:t>
+      </w:r>
+      <w:r>
+        <w:rPr>
+          <w:rStyle w:val="inline-code"/>
+        </w:rPr>
+        <w:t>Info</w:t>
+      </w:r>
+      <w:r>
+        <w:rPr/>
+        <w:t xml:space="preserve"> i </w:t>
+      </w:r>
+      <w:r>
+        <w:rPr>
+          <w:rStyle w:val="inline-code"/>
+        </w:rPr>
+        <w:t>Debug</w:t>
+      </w:r>
+      <w:r>
+        <w:rPr/>
+        <w:t xml:space="preserve"> i uruchamiaj program. Omów wpływ zmiany na liczbę zapisywanych logów. Omów korzyści praktyczne płynące z umieszczania funkcji logujących w całym programie i przełączania poziomu logów w jednym miejscu.</w:t>
+      </w:r>
+    </w:p>
+    <w:p>
+      <w:pPr>
+        <w:pStyle w:val="Zadanie"/>
+        <w:rPr/>
+      </w:pPr>
+      <w:r>
+        <w:rPr/>
+      </w:r>
+    </w:p>
+    <w:p>
+      <w:pPr>
+        <w:pStyle w:val="Zadanie"/>
+        <w:rPr/>
+      </w:pPr>
+      <w:r>
+        <w:rPr/>
+        <w:t>…</w:t>
+      </w:r>
+      <w:r>
+        <w:rPr/>
+        <w:t>omówienie…</w:t>
+      </w:r>
+    </w:p>
+    <w:p>
+      <w:pPr>
+        <w:pStyle w:val="Zadanie"/>
+        <w:rPr/>
+      </w:pPr>
+      <w:r>
+        <w:rPr/>
+      </w:r>
+    </w:p>
+    <w:p>
+      <w:pPr>
+        <w:pStyle w:val="Zadanie"/>
+        <w:rPr/>
+      </w:pPr>
+      <w:r>
+        <w:rPr/>
+        <w:t xml:space="preserve">Wstaw reprezentatywny fragment pliku </w:t>
+      </w:r>
+      <w:r>
+        <w:rPr>
+          <w:rStyle w:val="inline-code"/>
+        </w:rPr>
+        <w:t>monolog.log</w:t>
+      </w:r>
+      <w:r>
+        <w:rPr/>
+        <w:t>:</w:t>
+      </w:r>
+    </w:p>
+    <w:p>
+      <w:pPr>
+        <w:pStyle w:val="Zadanie"/>
+        <w:rPr/>
+      </w:pPr>
+      <w:r>
+        <w:rPr/>
+      </w:r>
+    </w:p>
+    <w:p>
+      <w:pPr>
+        <w:pStyle w:val="Zadanie"/>
+        <w:rPr/>
+      </w:pPr>
+      <w:r>
+        <w:rPr/>
+        <w:t>…</w:t>
+      </w:r>
+      <w:r>
+        <w:rPr/>
+        <w:t>wycinek monolog.log…</w:t>
+      </w:r>
+    </w:p>
+    <w:tbl>
+      <w:tblPr>
+        <w:tblStyle w:val="Tabela-Siatka"/>
+        <w:tblW w:w="5000" w:type="pct"/>
+        <w:jc w:val="start"/>
+        <w:tblInd w:w="113" w:type="dxa"/>
+        <w:tblLayout w:type="fixed"/>
+        <w:tblCellMar>
+          <w:top w:w="0" w:type="dxa"/>
+          <w:start w:w="108" w:type="dxa"/>
+          <w:bottom w:w="0" w:type="dxa"/>
+          <w:end w:w="108" w:type="dxa"/>
+        </w:tblCellMar>
+        <w:tblLook w:val="04a0" w:firstRow="1" w:noVBand="1" w:lastRow="0" w:firstColumn="1" w:lastColumn="0" w:noHBand="0"/>
+      </w:tblPr>
+      <w:tblGrid>
+        <w:gridCol w:w="8193"/>
+        <w:gridCol w:w="1137"/>
+        <w:gridCol w:w="1136"/>
+      </w:tblGrid>
+      <w:tr>
+        <w:trPr>
+          <w:trHeight w:val="567" w:hRule="exact"/>
+        </w:trPr>
+        <w:tc>
+          <w:tcPr>
+            <w:tcW w:w="8193" w:type="dxa"/>
+            <w:tcBorders/>
+            <w:vAlign w:val="center"/>
+          </w:tcPr>
+          <w:p>
+            <w:pPr>
+              <w:pStyle w:val="PunktyTabela"/>
+              <w:widowControl/>
+              <w:suppressAutoHyphens w:val="true"/>
+              <w:spacing w:before="0" w:after="0"/>
+              <w:jc w:val="start"/>
+              <w:rPr>
+                <w:rFonts w:ascii="Calibri" w:hAnsi="Calibri" w:eastAsia="Calibri" w:cs="Arial"/>
+                <w:kern w:val="2"/>
+                <w:sz w:val="22"/>
+                <w:szCs w:val="22"/>
+                <w:lang w:eastAsia="en-US" w:bidi="ar-SA"/>
+              </w:rPr>
+            </w:pPr>
+            <w:r>
+              <w:rPr>
+                <w:rFonts w:eastAsia="Calibri" w:cs="Arial"/>
+                <w:kern w:val="2"/>
+                <w:sz w:val="22"/>
+                <w:szCs w:val="22"/>
+                <w:lang w:eastAsia="en-US" w:bidi="ar-SA"/>
+              </w:rPr>
+              <w:t>Punkty:</w:t>
+            </w:r>
+          </w:p>
+        </w:tc>
+        <w:tc>
+          <w:tcPr>
+            <w:tcW w:w="1137" w:type="dxa"/>
+            <w:tcBorders/>
+            <w:vAlign w:val="center"/>
+          </w:tcPr>
+          <w:p>
+            <w:pPr>
+              <w:pStyle w:val="PunktyTabela"/>
+              <w:widowControl/>
+              <w:suppressAutoHyphens w:val="true"/>
+              <w:spacing w:before="0" w:after="0"/>
+              <w:jc w:val="center"/>
+              <w:rPr>
+                <w:rFonts w:ascii="Calibri" w:hAnsi="Calibri" w:eastAsia="Calibri" w:cs="Arial"/>
+                <w:kern w:val="2"/>
+                <w:sz w:val="22"/>
+                <w:szCs w:val="22"/>
+                <w:lang w:eastAsia="en-US" w:bidi="ar-SA"/>
+              </w:rPr>
+            </w:pPr>
+            <w:r>
+              <w:rPr>
+                <w:rFonts w:eastAsia="Calibri" w:cs="Arial"/>
+                <w:kern w:val="2"/>
+                <w:sz w:val="22"/>
+                <w:szCs w:val="22"/>
+                <w:lang w:eastAsia="en-US" w:bidi="ar-SA"/>
+              </w:rPr>
               <w:t>0</w:t>
             </w:r>
           </w:p>
@@ -5189,12 +5809,12 @@
         <w:pStyle w:val="Heading1"/>
         <w:rPr/>
       </w:pPr>
-      <w:bookmarkStart w:id="8" w:name="_Toc240323090"/>
-      <w:r>
-        <w:rPr/>
-        <w:t>Wykorzystanie różnych poziomów logowania Monolog</w:t>
-      </w:r>
-      <w:bookmarkEnd w:id="8"/>
+      <w:bookmarkStart w:id="9" w:name="_Toc240323091"/>
+      <w:r>
+        <w:rPr/>
+        <w:t>Dependency Injection</w:t>
+      </w:r>
+      <w:bookmarkEnd w:id="9"/>
     </w:p>
     <w:p>
       <w:pPr>
@@ -5207,19 +5827,1044 @@
         <w:rPr>
           <w:lang w:val="pl-PL"/>
         </w:rPr>
-        <w:t xml:space="preserve">W tej części wykorzystamy bibliotekę monolog do logowania komunikatów i błędów. Zmodyfikuj kod </w:t>
-      </w:r>
-      <w:r>
-        <w:rPr>
-          <w:rStyle w:val="inline-code"/>
-        </w:rPr>
-        <w:t>index.php</w:t>
-      </w:r>
-      <w:r>
-        <w:rPr>
-          <w:lang w:val="pl-PL"/>
-        </w:rPr>
-        <w:t xml:space="preserve">, żeby dodać logowanie do pliku </w:t>
+        <w:t xml:space="preserve">Dependency injection to technika programistyczna wchodząca w skład architektury heksagonalnej, który umożliwia uniezależnienie klasy od jej zależności. W tej sekcji wstrzykniemy do klasy </w:t>
+      </w:r>
+      <w:r>
+        <w:rPr>
+          <w:rStyle w:val="inline-code"/>
+        </w:rPr>
+        <w:t>Duck</w:t>
+      </w:r>
+      <w:r>
+        <w:rPr>
+          <w:lang w:val="pl-PL"/>
+        </w:rPr>
+        <w:t xml:space="preserve"> loggera, aby można było logować zdarzenia w instancjach tej klasy.</w:t>
+      </w:r>
+    </w:p>
+    <w:p>
+      <w:pPr>
+        <w:pStyle w:val="Normal"/>
+        <w:rPr>
+          <w:lang w:val="pl-PL"/>
+        </w:rPr>
+      </w:pPr>
+      <w:r>
+        <w:rPr>
+          <w:lang w:val="pl-PL"/>
+        </w:rPr>
+        <w:t xml:space="preserve">Zmodyfikuj klasę </w:t>
+      </w:r>
+      <w:r>
+        <w:rPr>
+          <w:rStyle w:val="inline-code"/>
+        </w:rPr>
+        <w:t>Duck.php</w:t>
+      </w:r>
+      <w:r>
+        <w:rPr>
+          <w:lang w:val="pl-PL"/>
+        </w:rPr>
+        <w:t>, żeby:</w:t>
+      </w:r>
+    </w:p>
+    <w:p>
+      <w:pPr>
+        <w:pStyle w:val="ListParagraph"/>
+        <w:numPr>
+          <w:ilvl w:val="0"/>
+          <w:numId w:val="5"/>
+        </w:numPr>
+        <w:rPr>
+          <w:lang w:val="pl-PL"/>
+        </w:rPr>
+      </w:pPr>
+      <w:r>
+        <w:rPr>
+          <w:lang w:val="pl-PL"/>
+        </w:rPr>
+        <w:t xml:space="preserve">wykorzystywała technikę </w:t>
+      </w:r>
+      <w:r>
+        <w:rPr>
+          <w:rStyle w:val="inline-code"/>
+        </w:rPr>
+        <w:t>Dependency Injection</w:t>
+      </w:r>
+      <w:r>
+        <w:rPr>
+          <w:lang w:val="pl-PL"/>
+        </w:rPr>
+        <w:t xml:space="preserve"> do przekazywania obiektu klasy </w:t>
+      </w:r>
+      <w:r>
+        <w:rPr>
+          <w:rStyle w:val="inline-code"/>
+        </w:rPr>
+        <w:t>LoggerInterface</w:t>
+      </w:r>
+      <w:r>
+        <w:rPr>
+          <w:lang w:val="pl-PL"/>
+        </w:rPr>
+        <w:t>;</w:t>
+      </w:r>
+    </w:p>
+    <w:p>
+      <w:pPr>
+        <w:pStyle w:val="ListParagraph"/>
+        <w:numPr>
+          <w:ilvl w:val="0"/>
+          <w:numId w:val="5"/>
+        </w:numPr>
+        <w:rPr>
+          <w:lang w:val="pl-PL"/>
+        </w:rPr>
+      </w:pPr>
+      <w:r>
+        <w:rPr>
+          <w:lang w:val="pl-PL"/>
+        </w:rPr>
+        <w:t xml:space="preserve">logowała (poziom </w:t>
+      </w:r>
+      <w:r>
+        <w:rPr>
+          <w:rStyle w:val="inline-code"/>
+        </w:rPr>
+        <w:t>Info</w:t>
+      </w:r>
+      <w:r>
+        <w:rPr>
+          <w:lang w:val="pl-PL"/>
+        </w:rPr>
+        <w:t xml:space="preserve">) stworzenie klasy </w:t>
+      </w:r>
+      <w:r>
+        <w:rPr>
+          <w:rStyle w:val="inline-code"/>
+        </w:rPr>
+        <w:t>Duck</w:t>
+      </w:r>
+      <w:r>
+        <w:rPr>
+          <w:lang w:val="pl-PL"/>
+        </w:rPr>
+        <w:t>;</w:t>
+      </w:r>
+    </w:p>
+    <w:p>
+      <w:pPr>
+        <w:pStyle w:val="ListParagraph"/>
+        <w:numPr>
+          <w:ilvl w:val="0"/>
+          <w:numId w:val="5"/>
+        </w:numPr>
+        <w:rPr>
+          <w:lang w:val="pl-PL"/>
+        </w:rPr>
+      </w:pPr>
+      <w:r>
+        <w:rPr>
+          <w:lang w:val="pl-PL"/>
+        </w:rPr>
+        <w:t xml:space="preserve">logowała (poziom </w:t>
+      </w:r>
+      <w:r>
+        <w:rPr>
+          <w:rStyle w:val="inline-code"/>
+        </w:rPr>
+        <w:t>Debug</w:t>
+      </w:r>
+      <w:r>
+        <w:rPr>
+          <w:lang w:val="pl-PL"/>
+        </w:rPr>
+        <w:t xml:space="preserve">) wykonanie metody </w:t>
+      </w:r>
+      <w:r>
+        <w:rPr>
+          <w:rStyle w:val="inline-code"/>
+        </w:rPr>
+        <w:t>Duck::quack()</w:t>
+      </w:r>
+      <w:r>
+        <w:rPr>
+          <w:lang w:val="pl-PL"/>
+        </w:rPr>
+        <w:t>.</w:t>
+      </w:r>
+    </w:p>
+    <w:p>
+      <w:pPr>
+        <w:pStyle w:val="Normal"/>
+        <w:rPr>
+          <w:lang w:val="pl-PL"/>
+        </w:rPr>
+      </w:pPr>
+      <w:r>
+        <w:rPr>
+          <w:lang w:val="pl-PL"/>
+        </w:rPr>
+        <w:t xml:space="preserve">Następnie przetestuj uruchamianie kodu źródłowego z poziomami logowania </w:t>
+      </w:r>
+      <w:r>
+        <w:rPr>
+          <w:rStyle w:val="inline-code"/>
+        </w:rPr>
+        <w:t>ERROR</w:t>
+      </w:r>
+      <w:r>
+        <w:rPr>
+          <w:lang w:val="pl-PL"/>
+        </w:rPr>
+        <w:t xml:space="preserve">, </w:t>
+      </w:r>
+      <w:r>
+        <w:rPr>
+          <w:rStyle w:val="inline-code"/>
+        </w:rPr>
+        <w:t>WARNING</w:t>
+      </w:r>
+      <w:r>
+        <w:rPr>
+          <w:lang w:val="pl-PL"/>
+        </w:rPr>
+        <w:t xml:space="preserve">, </w:t>
+      </w:r>
+      <w:r>
+        <w:rPr>
+          <w:rStyle w:val="inline-code"/>
+        </w:rPr>
+        <w:t>INFO</w:t>
+      </w:r>
+      <w:r>
+        <w:rPr>
+          <w:lang w:val="pl-PL"/>
+        </w:rPr>
+        <w:t xml:space="preserve">, </w:t>
+      </w:r>
+      <w:r>
+        <w:rPr>
+          <w:rStyle w:val="inline-code"/>
+        </w:rPr>
+        <w:t>DEBUG</w:t>
+      </w:r>
+      <w:r>
+        <w:rPr>
+          <w:lang w:val="pl-PL"/>
+        </w:rPr>
+        <w:t>.</w:t>
+      </w:r>
+    </w:p>
+    <w:p>
+      <w:pPr>
+        <w:pStyle w:val="block-code"/>
+        <w:rPr/>
+      </w:pPr>
+      <w:r>
+        <w:rPr/>
+        <w:t>&lt;?php // src/Duck.php</w:t>
+      </w:r>
+    </w:p>
+    <w:p>
+      <w:pPr>
+        <w:pStyle w:val="block-code"/>
+        <w:rPr/>
+      </w:pPr>
+      <w:r>
+        <w:rPr/>
+        <w:t>namespace Akarczmarczyk\LabComposer;</w:t>
+      </w:r>
+    </w:p>
+    <w:p>
+      <w:pPr>
+        <w:pStyle w:val="block-code"/>
+        <w:rPr/>
+      </w:pPr>
+      <w:r>
+        <w:rPr/>
+      </w:r>
+    </w:p>
+    <w:p>
+      <w:pPr>
+        <w:pStyle w:val="block-code"/>
+        <w:rPr>
+          <w:color w:themeColor="text1" w:themeTint="f2" w:val="0D0D0D"/>
+          <w:lang w:val="en-US"/>
+        </w:rPr>
+      </w:pPr>
+      <w:r>
+        <w:rPr>
+          <w:color w:themeColor="text1" w:themeTint="f2" w:val="0D0D0D"/>
+          <w:lang w:val="en-US"/>
+        </w:rPr>
+        <w:t>use Psr\Log\LoggerInterface;</w:t>
+      </w:r>
+    </w:p>
+    <w:p>
+      <w:pPr>
+        <w:pStyle w:val="block-code"/>
+        <w:rPr>
+          <w:lang w:val="en-US"/>
+        </w:rPr>
+      </w:pPr>
+      <w:r>
+        <w:rPr>
+          <w:lang w:val="en-US"/>
+        </w:rPr>
+      </w:r>
+    </w:p>
+    <w:p>
+      <w:pPr>
+        <w:pStyle w:val="block-code"/>
+        <w:rPr>
+          <w:lang w:val="en-US"/>
+        </w:rPr>
+      </w:pPr>
+      <w:r>
+        <w:rPr>
+          <w:lang w:val="en-US"/>
+        </w:rPr>
+        <w:t>class Duck</w:t>
+      </w:r>
+    </w:p>
+    <w:p>
+      <w:pPr>
+        <w:pStyle w:val="block-code"/>
+        <w:rPr>
+          <w:lang w:val="en-US"/>
+        </w:rPr>
+      </w:pPr>
+      <w:r>
+        <w:rPr>
+          <w:lang w:val="en-US"/>
+        </w:rPr>
+        <w:t>{</w:t>
+      </w:r>
+    </w:p>
+    <w:p>
+      <w:pPr>
+        <w:pStyle w:val="block-code"/>
+        <w:rPr>
+          <w:color w:themeColor="text1" w:themeTint="f2" w:val="0D0D0D"/>
+          <w:lang w:val="en-US"/>
+        </w:rPr>
+      </w:pPr>
+      <w:r>
+        <w:rPr>
+          <w:color w:themeColor="text1" w:themeTint="f2" w:val="0D0D0D"/>
+          <w:lang w:val="en-US"/>
+        </w:rPr>
+        <w:t xml:space="preserve">    </w:t>
+      </w:r>
+      <w:r>
+        <w:rPr>
+          <w:color w:themeColor="text1" w:themeTint="f2" w:val="0D0D0D"/>
+          <w:lang w:val="en-US"/>
+        </w:rPr>
+        <w:t>/** @var LoggerInterface */</w:t>
+      </w:r>
+    </w:p>
+    <w:p>
+      <w:pPr>
+        <w:pStyle w:val="block-code"/>
+        <w:rPr>
+          <w:color w:themeColor="text1" w:themeTint="f2" w:val="0D0D0D"/>
+          <w:lang w:val="en-US"/>
+        </w:rPr>
+      </w:pPr>
+      <w:r>
+        <w:rPr>
+          <w:color w:themeColor="text1" w:themeTint="f2" w:val="0D0D0D"/>
+          <w:lang w:val="en-US"/>
+        </w:rPr>
+        <w:t xml:space="preserve">    </w:t>
+      </w:r>
+      <w:r>
+        <w:rPr>
+          <w:color w:themeColor="text1" w:themeTint="f2" w:val="0D0D0D"/>
+          <w:lang w:val="en-US"/>
+        </w:rPr>
+        <w:t>private $logger;</w:t>
+      </w:r>
+    </w:p>
+    <w:p>
+      <w:pPr>
+        <w:pStyle w:val="block-code"/>
+        <w:rPr>
+          <w:color w:themeColor="text1" w:themeTint="f2" w:val="0D0D0D"/>
+          <w:lang w:val="en-US"/>
+        </w:rPr>
+      </w:pPr>
+      <w:r>
+        <w:rPr>
+          <w:color w:themeColor="text1" w:themeTint="f2" w:val="0D0D0D"/>
+          <w:lang w:val="en-US"/>
+        </w:rPr>
+      </w:r>
+    </w:p>
+    <w:p>
+      <w:pPr>
+        <w:pStyle w:val="block-code"/>
+        <w:rPr>
+          <w:color w:themeColor="text1" w:themeTint="f2" w:val="0D0D0D"/>
+          <w:lang w:val="en-US"/>
+        </w:rPr>
+      </w:pPr>
+      <w:r>
+        <w:rPr>
+          <w:color w:themeColor="text1" w:themeTint="f2" w:val="0D0D0D"/>
+          <w:lang w:val="en-US"/>
+        </w:rPr>
+        <w:t xml:space="preserve">    </w:t>
+      </w:r>
+      <w:r>
+        <w:rPr>
+          <w:color w:themeColor="text1" w:themeTint="f2" w:val="0D0D0D"/>
+          <w:lang w:val="en-US"/>
+        </w:rPr>
+        <w:t>public function __construct(?LoggerInterface $logger = null)</w:t>
+      </w:r>
+    </w:p>
+    <w:p>
+      <w:pPr>
+        <w:pStyle w:val="block-code"/>
+        <w:rPr>
+          <w:color w:themeColor="text1" w:themeTint="f2" w:val="0D0D0D"/>
+          <w:lang w:val="en-US"/>
+        </w:rPr>
+      </w:pPr>
+      <w:r>
+        <w:rPr>
+          <w:color w:themeColor="text1" w:themeTint="f2" w:val="0D0D0D"/>
+          <w:lang w:val="en-US"/>
+        </w:rPr>
+        <w:t xml:space="preserve">    </w:t>
+      </w:r>
+      <w:r>
+        <w:rPr>
+          <w:color w:themeColor="text1" w:themeTint="f2" w:val="0D0D0D"/>
+          <w:lang w:val="en-US"/>
+        </w:rPr>
+        <w:t>{</w:t>
+      </w:r>
+    </w:p>
+    <w:p>
+      <w:pPr>
+        <w:pStyle w:val="block-code"/>
+        <w:rPr>
+          <w:color w:themeColor="text1" w:themeTint="f2" w:val="0D0D0D"/>
+          <w:lang w:val="en-US"/>
+        </w:rPr>
+      </w:pPr>
+      <w:r>
+        <w:rPr>
+          <w:color w:themeColor="text1" w:themeTint="f2" w:val="0D0D0D"/>
+          <w:lang w:val="en-US"/>
+        </w:rPr>
+        <w:t xml:space="preserve">        </w:t>
+      </w:r>
+      <w:r>
+        <w:rPr>
+          <w:color w:themeColor="text1" w:themeTint="f2" w:val="0D0D0D"/>
+          <w:lang w:val="en-US"/>
+        </w:rPr>
+        <w:t>$this-&gt;logger = $logger;</w:t>
+      </w:r>
+    </w:p>
+    <w:p>
+      <w:pPr>
+        <w:pStyle w:val="block-code"/>
+        <w:rPr>
+          <w:color w:themeColor="text1" w:themeTint="f2" w:val="0D0D0D"/>
+          <w:lang w:val="en-US"/>
+        </w:rPr>
+      </w:pPr>
+      <w:r>
+        <w:rPr>
+          <w:color w:themeColor="text1" w:themeTint="f2" w:val="0D0D0D"/>
+          <w:lang w:val="en-US"/>
+        </w:rPr>
+        <w:t xml:space="preserve">        </w:t>
+      </w:r>
+      <w:r>
+        <w:rPr>
+          <w:color w:themeColor="text1" w:themeTint="f2" w:val="0D0D0D"/>
+          <w:lang w:val="en-US"/>
+        </w:rPr>
+        <w:t>if ($this-&gt;logger) {</w:t>
+      </w:r>
+    </w:p>
+    <w:p>
+      <w:pPr>
+        <w:pStyle w:val="block-code"/>
+        <w:rPr>
+          <w:color w:themeColor="text1" w:themeTint="f2" w:val="0D0D0D"/>
+          <w:lang w:val="en-US"/>
+        </w:rPr>
+      </w:pPr>
+      <w:r>
+        <w:rPr>
+          <w:color w:themeColor="text1" w:themeTint="f2" w:val="0D0D0D"/>
+          <w:lang w:val="en-US"/>
+        </w:rPr>
+        <w:t xml:space="preserve">            </w:t>
+      </w:r>
+      <w:r>
+        <w:rPr>
+          <w:color w:themeColor="text1" w:themeTint="f2" w:val="0D0D0D"/>
+          <w:lang w:val="en-US"/>
+        </w:rPr>
+        <w:t>$this-&gt;logger-&gt;info("Duck created.");</w:t>
+      </w:r>
+    </w:p>
+    <w:p>
+      <w:pPr>
+        <w:pStyle w:val="block-code"/>
+        <w:rPr>
+          <w:color w:themeColor="text1" w:themeTint="f2" w:val="0D0D0D"/>
+          <w:lang w:val="en-US"/>
+        </w:rPr>
+      </w:pPr>
+      <w:r>
+        <w:rPr>
+          <w:color w:themeColor="text1" w:themeTint="f2" w:val="0D0D0D"/>
+          <w:lang w:val="en-US"/>
+        </w:rPr>
+        <w:t xml:space="preserve">        </w:t>
+      </w:r>
+      <w:r>
+        <w:rPr>
+          <w:color w:themeColor="text1" w:themeTint="f2" w:val="0D0D0D"/>
+          <w:lang w:val="en-US"/>
+        </w:rPr>
+        <w:t>}</w:t>
+      </w:r>
+    </w:p>
+    <w:p>
+      <w:pPr>
+        <w:pStyle w:val="block-code"/>
+        <w:rPr>
+          <w:color w:themeColor="text1" w:themeTint="f2" w:val="0D0D0D"/>
+          <w:lang w:val="en-US"/>
+        </w:rPr>
+      </w:pPr>
+      <w:r>
+        <w:rPr>
+          <w:color w:themeColor="text1" w:themeTint="f2" w:val="0D0D0D"/>
+          <w:lang w:val="en-US"/>
+        </w:rPr>
+        <w:t xml:space="preserve">    </w:t>
+      </w:r>
+      <w:r>
+        <w:rPr>
+          <w:color w:themeColor="text1" w:themeTint="f2" w:val="0D0D0D"/>
+          <w:lang w:val="en-US"/>
+        </w:rPr>
+        <w:t>}</w:t>
+      </w:r>
+    </w:p>
+    <w:p>
+      <w:pPr>
+        <w:pStyle w:val="block-code"/>
+        <w:rPr>
+          <w:lang w:val="en-US"/>
+        </w:rPr>
+      </w:pPr>
+      <w:r>
+        <w:rPr>
+          <w:lang w:val="en-US"/>
+        </w:rPr>
+      </w:r>
+    </w:p>
+    <w:p>
+      <w:pPr>
+        <w:pStyle w:val="block-code"/>
+        <w:rPr>
+          <w:lang w:val="en-US"/>
+        </w:rPr>
+      </w:pPr>
+      <w:r>
+        <w:rPr>
+          <w:lang w:val="en-US"/>
+        </w:rPr>
+        <w:t xml:space="preserve">    </w:t>
+      </w:r>
+      <w:r>
+        <w:rPr>
+          <w:lang w:val="en-US"/>
+        </w:rPr>
+        <w:t>public function quack()</w:t>
+      </w:r>
+    </w:p>
+    <w:p>
+      <w:pPr>
+        <w:pStyle w:val="block-code"/>
+        <w:rPr>
+          <w:lang w:val="en-US"/>
+        </w:rPr>
+      </w:pPr>
+      <w:r>
+        <w:rPr>
+          <w:lang w:val="en-US"/>
+        </w:rPr>
+        <w:t xml:space="preserve">    </w:t>
+      </w:r>
+      <w:r>
+        <w:rPr>
+          <w:lang w:val="en-US"/>
+        </w:rPr>
+        <w:t>{</w:t>
+      </w:r>
+    </w:p>
+    <w:p>
+      <w:pPr>
+        <w:pStyle w:val="block-code"/>
+        <w:rPr>
+          <w:color w:themeColor="text1" w:themeTint="f2" w:val="0D0D0D"/>
+          <w:lang w:val="en-US"/>
+        </w:rPr>
+      </w:pPr>
+      <w:r>
+        <w:rPr>
+          <w:color w:themeColor="text1" w:themeTint="f2" w:val="0D0D0D"/>
+          <w:lang w:val="en-US"/>
+        </w:rPr>
+        <w:t xml:space="preserve">        </w:t>
+      </w:r>
+      <w:r>
+        <w:rPr>
+          <w:color w:themeColor="text1" w:themeTint="f2" w:val="0D0D0D"/>
+          <w:lang w:val="en-US"/>
+        </w:rPr>
+        <w:t>if ($this-&gt;logger) {</w:t>
+      </w:r>
+    </w:p>
+    <w:p>
+      <w:pPr>
+        <w:pStyle w:val="block-code"/>
+        <w:rPr>
+          <w:color w:themeColor="text1" w:themeTint="f2" w:val="0D0D0D"/>
+          <w:lang w:val="en-US"/>
+        </w:rPr>
+      </w:pPr>
+      <w:r>
+        <w:rPr>
+          <w:color w:themeColor="text1" w:themeTint="f2" w:val="0D0D0D"/>
+          <w:lang w:val="en-US"/>
+        </w:rPr>
+        <w:t xml:space="preserve">            </w:t>
+      </w:r>
+      <w:r>
+        <w:rPr>
+          <w:color w:themeColor="text1" w:themeTint="f2" w:val="0D0D0D"/>
+          <w:lang w:val="en-US"/>
+        </w:rPr>
+        <w:t>$this-&gt;logger-&gt;debug("Quack() executed.");</w:t>
+      </w:r>
+    </w:p>
+    <w:p>
+      <w:pPr>
+        <w:pStyle w:val="block-code"/>
+        <w:rPr>
+          <w:color w:themeColor="text1" w:themeTint="f2" w:val="0D0D0D"/>
+          <w:lang w:val="en-US"/>
+        </w:rPr>
+      </w:pPr>
+      <w:r>
+        <w:rPr>
+          <w:color w:themeColor="text1" w:themeTint="f2" w:val="0D0D0D"/>
+          <w:lang w:val="en-US"/>
+        </w:rPr>
+        <w:t xml:space="preserve">        </w:t>
+      </w:r>
+      <w:r>
+        <w:rPr>
+          <w:color w:themeColor="text1" w:themeTint="f2" w:val="0D0D0D"/>
+          <w:lang w:val="en-US"/>
+        </w:rPr>
+        <w:t>}</w:t>
+      </w:r>
+    </w:p>
+    <w:p>
+      <w:pPr>
+        <w:pStyle w:val="block-code"/>
+        <w:rPr>
+          <w:lang w:val="en-US"/>
+        </w:rPr>
+      </w:pPr>
+      <w:r>
+        <w:rPr>
+          <w:lang w:val="en-US"/>
+        </w:rPr>
+        <w:t xml:space="preserve">        </w:t>
+      </w:r>
+      <w:r>
+        <w:rPr>
+          <w:lang w:val="en-US"/>
+        </w:rPr>
+        <w:t>echo "Quack\n";</w:t>
+      </w:r>
+    </w:p>
+    <w:p>
+      <w:pPr>
+        <w:pStyle w:val="block-code"/>
+        <w:rPr>
+          <w:lang w:val="en-US"/>
+        </w:rPr>
+      </w:pPr>
+      <w:r>
+        <w:rPr>
+          <w:lang w:val="en-US"/>
+        </w:rPr>
+        <w:t xml:space="preserve">    </w:t>
+      </w:r>
+      <w:r>
+        <w:rPr>
+          <w:lang w:val="en-US"/>
+        </w:rPr>
+        <w:t>}</w:t>
+      </w:r>
+    </w:p>
+    <w:p>
+      <w:pPr>
+        <w:pStyle w:val="block-code"/>
+        <w:rPr>
+          <w:lang w:val="en-US"/>
+        </w:rPr>
+      </w:pPr>
+      <w:r>
+        <w:rPr>
+          <w:lang w:val="en-US"/>
+        </w:rPr>
+        <w:t>}</w:t>
+      </w:r>
+    </w:p>
+    <w:p>
+      <w:pPr>
+        <w:pStyle w:val="Normal"/>
+        <w:rPr/>
+      </w:pPr>
+      <w:r>
+        <w:rPr/>
+      </w:r>
+    </w:p>
+    <w:p>
+      <w:pPr>
+        <w:pStyle w:val="block-code"/>
+        <w:rPr>
+          <w:lang w:val="en-US"/>
+        </w:rPr>
+      </w:pPr>
+      <w:r>
+        <w:rPr>
+          <w:lang w:val="en-US"/>
+        </w:rPr>
+        <w:t>&lt;?php // index.php</w:t>
+      </w:r>
+    </w:p>
+    <w:p>
+      <w:pPr>
+        <w:pStyle w:val="block-code"/>
+        <w:rPr>
+          <w:lang w:val="en-US"/>
+        </w:rPr>
+      </w:pPr>
+      <w:r>
+        <w:rPr>
+          <w:lang w:val="en-US"/>
+        </w:rPr>
+        <w:t>require_once __DIR__ . '/vendor/autoload.php';</w:t>
+      </w:r>
+    </w:p>
+    <w:p>
+      <w:pPr>
+        <w:pStyle w:val="block-code"/>
+        <w:rPr>
+          <w:lang w:val="en-US"/>
+        </w:rPr>
+      </w:pPr>
+      <w:r>
+        <w:rPr>
+          <w:lang w:val="en-US"/>
+        </w:rPr>
+      </w:r>
+    </w:p>
+    <w:p>
+      <w:pPr>
+        <w:pStyle w:val="block-code"/>
+        <w:rPr>
+          <w:lang w:val="en-US"/>
+        </w:rPr>
+      </w:pPr>
+      <w:r>
+        <w:rPr>
+          <w:lang w:val="en-US"/>
+        </w:rPr>
+        <w:t>$ds = DIRECTORY_SEPARATOR;</w:t>
+      </w:r>
+    </w:p>
+    <w:p>
+      <w:pPr>
+        <w:pStyle w:val="block-code"/>
+        <w:rPr>
+          <w:lang w:val="en-US"/>
+        </w:rPr>
+      </w:pPr>
+      <w:r>
+        <w:rPr>
+          <w:lang w:val="en-US"/>
+        </w:rPr>
+        <w:t>$log = new \Monolog\Logger("my_log");</w:t>
+      </w:r>
+    </w:p>
+    <w:p>
+      <w:pPr>
+        <w:pStyle w:val="block-code"/>
+        <w:rPr>
+          <w:lang w:val="es-ES"/>
+        </w:rPr>
+      </w:pPr>
+      <w:r>
+        <w:rPr>
+          <w:lang w:val="en-US"/>
+        </w:rPr>
+        <w:t xml:space="preserve">$log-&gt;pushHandler(new \Monolog\Handler\StreamHandler(__DIR__ . </w:t>
+      </w:r>
+      <w:r>
+        <w:rPr>
+          <w:lang w:val="es-ES"/>
+        </w:rPr>
+        <w:t>$ds . 'monolog.log', \Monolog\</w:t>
+      </w:r>
+      <w:r>
+        <w:rPr>
+          <w:highlight w:val="yellow"/>
+          <w:lang w:val="es-ES"/>
+        </w:rPr>
+        <w:t>Level::Error</w:t>
+      </w:r>
+      <w:r>
+        <w:rPr>
+          <w:lang w:val="es-ES"/>
+        </w:rPr>
+        <w:t>));</w:t>
+      </w:r>
+    </w:p>
+    <w:p>
+      <w:pPr>
+        <w:pStyle w:val="block-code"/>
+        <w:rPr>
+          <w:lang w:val="en-US"/>
+        </w:rPr>
+      </w:pPr>
+      <w:r>
+        <w:rPr>
+          <w:lang w:val="en-US"/>
+        </w:rPr>
+        <w:t>$log-&gt;error("error");</w:t>
+      </w:r>
+    </w:p>
+    <w:p>
+      <w:pPr>
+        <w:pStyle w:val="block-code"/>
+        <w:rPr>
+          <w:lang w:val="en-US"/>
+        </w:rPr>
+      </w:pPr>
+      <w:r>
+        <w:rPr>
+          <w:lang w:val="en-US"/>
+        </w:rPr>
+        <w:t>$log-&gt;warning("warning");</w:t>
+      </w:r>
+    </w:p>
+    <w:p>
+      <w:pPr>
+        <w:pStyle w:val="block-code"/>
+        <w:rPr>
+          <w:lang w:val="en-US"/>
+        </w:rPr>
+      </w:pPr>
+      <w:r>
+        <w:rPr>
+          <w:lang w:val="en-US"/>
+        </w:rPr>
+      </w:r>
+    </w:p>
+    <w:p>
+      <w:pPr>
+        <w:pStyle w:val="block-code"/>
+        <w:rPr>
+          <w:lang w:val="en-US"/>
+        </w:rPr>
+      </w:pPr>
+      <w:r>
+        <w:rPr>
+          <w:lang w:val="en-US"/>
+        </w:rPr>
+        <w:t>$duck = new \Akarczmarczyk\LabComposer\Duck(</w:t>
+      </w:r>
+      <w:r>
+        <w:rPr>
+          <w:highlight w:val="green"/>
+          <w:lang w:val="en-US"/>
+        </w:rPr>
+        <w:t>$log</w:t>
+      </w:r>
+      <w:r>
+        <w:rPr>
+          <w:lang w:val="en-US"/>
+        </w:rPr>
+        <w:t>);</w:t>
+      </w:r>
+    </w:p>
+    <w:p>
+      <w:pPr>
+        <w:pStyle w:val="block-code"/>
+        <w:rPr>
+          <w:lang w:val="en-US"/>
+        </w:rPr>
+      </w:pPr>
+      <w:r>
+        <w:rPr>
+          <w:lang w:val="en-US"/>
+        </w:rPr>
+        <w:t>$duck-&gt;quack();</w:t>
+      </w:r>
+    </w:p>
+    <w:p>
+      <w:pPr>
+        <w:pStyle w:val="block-code"/>
+        <w:rPr>
+          <w:lang w:val="en-US"/>
+        </w:rPr>
+      </w:pPr>
+      <w:r>
+        <w:rPr>
+          <w:lang w:val="en-US"/>
+        </w:rPr>
+        <w:t>$duck-&gt;quack();</w:t>
+      </w:r>
+    </w:p>
+    <w:p>
+      <w:pPr>
+        <w:pStyle w:val="block-code"/>
+        <w:rPr>
+          <w:lang w:val="en-US"/>
+        </w:rPr>
+      </w:pPr>
+      <w:r>
+        <w:rPr>
+          <w:lang w:val="en-US"/>
+        </w:rPr>
+        <w:t>$duck-&gt;quack();</w:t>
+      </w:r>
+    </w:p>
+    <w:p>
+      <w:pPr>
+        <w:pStyle w:val="Normal"/>
+        <w:rPr>
+          <w:lang w:val="pl-PL"/>
+        </w:rPr>
+      </w:pPr>
+      <w:r>
+        <w:rPr>
+          <w:b/>
+          <w:bCs/>
+          <w:lang w:val="pl-PL"/>
+        </w:rPr>
+        <w:t xml:space="preserve">Nie działa? </w:t>
+      </w:r>
+      <w:r>
+        <w:rPr>
+          <w:lang w:val="pl-PL"/>
+        </w:rPr>
+        <w:t xml:space="preserve">Upewnij się, że do wywołania konstruktora </w:t>
+      </w:r>
+      <w:r>
+        <w:rPr>
+          <w:rStyle w:val="inline-code"/>
+        </w:rPr>
+        <w:t>Duck(…)</w:t>
+      </w:r>
+      <w:r>
+        <w:rPr>
+          <w:lang w:val="pl-PL"/>
+        </w:rPr>
+        <w:t xml:space="preserve"> przekazano </w:t>
+      </w:r>
+      <w:r>
+        <w:rPr>
+          <w:rStyle w:val="inline-code"/>
+        </w:rPr>
+        <w:t>$log</w:t>
+      </w:r>
+      <w:r>
+        <w:rPr>
+          <w:lang w:val="pl-PL"/>
+        </w:rPr>
+        <w:t>.</w:t>
+      </w:r>
+    </w:p>
+    <w:p>
+      <w:pPr>
+        <w:pStyle w:val="Zadanie"/>
+        <w:rPr/>
+      </w:pPr>
+      <w:r>
+        <w:rPr/>
+        <w:t xml:space="preserve">Kolejno zmieniaj </w:t>
+      </w:r>
+      <w:r>
+        <w:rPr>
+          <w:rStyle w:val="inline-code"/>
+        </w:rPr>
+        <w:t>Error</w:t>
+      </w:r>
+      <w:r>
+        <w:rPr/>
+        <w:t xml:space="preserve"> w kodzie na </w:t>
+      </w:r>
+      <w:r>
+        <w:rPr>
+          <w:rStyle w:val="inline-code"/>
+        </w:rPr>
+        <w:t>Warning</w:t>
+      </w:r>
+      <w:r>
+        <w:rPr/>
+        <w:t xml:space="preserve">, </w:t>
+      </w:r>
+      <w:r>
+        <w:rPr>
+          <w:rStyle w:val="inline-code"/>
+        </w:rPr>
+        <w:t>Notice</w:t>
+      </w:r>
+      <w:r>
+        <w:rPr/>
+        <w:t xml:space="preserve">, </w:t>
+      </w:r>
+      <w:r>
+        <w:rPr>
+          <w:rStyle w:val="inline-code"/>
+        </w:rPr>
+        <w:t>Info</w:t>
+      </w:r>
+      <w:r>
+        <w:rPr/>
+        <w:t xml:space="preserve"> i </w:t>
+      </w:r>
+      <w:r>
+        <w:rPr>
+          <w:rStyle w:val="inline-code"/>
+        </w:rPr>
+        <w:t>Debug</w:t>
+      </w:r>
+      <w:r>
+        <w:rPr/>
+        <w:t xml:space="preserve"> i uruchamiaj program. Omów wpływ zmiany na liczbę zapisywanych logów. Zamieść odpowiedni wycinek pliku </w:t>
       </w:r>
       <w:r>
         <w:rPr>
@@ -5228,380 +6873,17 @@
         <w:t>monolog.log</w:t>
       </w:r>
       <w:r>
-        <w:rPr>
-          <w:lang w:val="pl-PL"/>
-        </w:rPr>
+        <w:rPr/>
         <w:t>:</w:t>
       </w:r>
     </w:p>
     <w:p>
       <w:pPr>
-        <w:pStyle w:val="block-code"/>
-        <w:rPr>
-          <w:lang w:val="en-US"/>
-        </w:rPr>
-      </w:pPr>
-      <w:r>
-        <w:rPr>
-          <w:lang w:val="en-US"/>
-        </w:rPr>
-        <w:t>&lt;?php // index.php</w:t>
-      </w:r>
-    </w:p>
-    <w:p>
-      <w:pPr>
-        <w:pStyle w:val="block-code"/>
-        <w:rPr>
-          <w:lang w:val="en-US"/>
-        </w:rPr>
-      </w:pPr>
-      <w:r>
-        <w:rPr>
-          <w:lang w:val="en-US"/>
-        </w:rPr>
-        <w:t>require_once __DIR__ . '/vendor/autoload.php';</w:t>
-      </w:r>
-    </w:p>
-    <w:p>
-      <w:pPr>
-        <w:pStyle w:val="block-code"/>
-        <w:rPr>
-          <w:lang w:val="en-US"/>
-        </w:rPr>
-      </w:pPr>
-      <w:r>
-        <w:rPr>
-          <w:lang w:val="en-US"/>
-        </w:rPr>
-      </w:r>
-    </w:p>
-    <w:p>
-      <w:pPr>
-        <w:pStyle w:val="block-code"/>
-        <w:rPr>
-          <w:color w:themeColor="text1" w:themeTint="f2" w:val="0D0D0D"/>
-          <w:lang w:val="en-US"/>
-        </w:rPr>
-      </w:pPr>
-      <w:r>
-        <w:rPr>
-          <w:color w:themeColor="text1" w:themeTint="f2" w:val="0D0D0D"/>
-          <w:lang w:val="en-US"/>
-        </w:rPr>
-        <w:t>$ds = DIRECTORY_SEPARATOR;</w:t>
-      </w:r>
-    </w:p>
-    <w:p>
-      <w:pPr>
-        <w:pStyle w:val="block-code"/>
-        <w:rPr>
-          <w:color w:themeColor="text1" w:themeTint="f2" w:val="0D0D0D"/>
-          <w:lang w:val="en-US"/>
-        </w:rPr>
-      </w:pPr>
-      <w:r>
-        <w:rPr>
-          <w:color w:themeColor="text1" w:themeTint="f2" w:val="0D0D0D"/>
-          <w:lang w:val="en-US"/>
-        </w:rPr>
-        <w:t>$log = new \Monolog\Logger("my_log");</w:t>
-      </w:r>
-    </w:p>
-    <w:p>
-      <w:pPr>
-        <w:pStyle w:val="block-code"/>
-        <w:rPr>
-          <w:color w:themeColor="text1" w:themeTint="f2" w:val="0D0D0D"/>
-          <w:lang w:val="es-ES"/>
-        </w:rPr>
-      </w:pPr>
-      <w:r>
-        <w:rPr>
-          <w:color w:themeColor="text1" w:themeTint="f2" w:val="0D0D0D"/>
-          <w:lang w:val="en-US"/>
-        </w:rPr>
-        <w:t xml:space="preserve">$log-&gt;pushHandler(new \Monolog\Handler\StreamHandler(__DIR__ . </w:t>
-      </w:r>
-      <w:r>
-        <w:rPr>
-          <w:color w:themeColor="text1" w:themeTint="f2" w:val="0D0D0D"/>
-          <w:lang w:val="es-ES"/>
-        </w:rPr>
-        <w:t>$ds . 'monolog.log', \Monolog\Level::</w:t>
-      </w:r>
-      <w:r>
-        <w:rPr>
-          <w:color w:themeColor="text1" w:themeTint="f2" w:val="0D0D0D"/>
-          <w:highlight w:val="green"/>
-          <w:lang w:val="es-ES"/>
-        </w:rPr>
-        <w:t>Error</w:t>
-      </w:r>
-      <w:r>
-        <w:rPr>
-          <w:color w:themeColor="text1" w:themeTint="f2" w:val="0D0D0D"/>
-          <w:lang w:val="es-ES"/>
-        </w:rPr>
-        <w:t>));</w:t>
-      </w:r>
-    </w:p>
-    <w:p>
-      <w:pPr>
-        <w:pStyle w:val="block-code"/>
-        <w:rPr>
-          <w:color w:themeColor="text1" w:themeTint="f2" w:val="0D0D0D"/>
-          <w:lang w:val="en-US"/>
-        </w:rPr>
-      </w:pPr>
-      <w:r>
-        <w:rPr>
-          <w:color w:themeColor="text1" w:themeTint="f2" w:val="0D0D0D"/>
-          <w:lang w:val="en-US"/>
-        </w:rPr>
-        <w:t>$log-&gt;error("This is some error.");</w:t>
-      </w:r>
-    </w:p>
-    <w:p>
-      <w:pPr>
-        <w:pStyle w:val="block-code"/>
-        <w:rPr>
-          <w:color w:themeColor="text1" w:themeTint="f2" w:val="0D0D0D"/>
-          <w:lang w:val="en-US"/>
-        </w:rPr>
-      </w:pPr>
-      <w:r>
-        <w:rPr>
-          <w:color w:themeColor="text1" w:themeTint="f2" w:val="0D0D0D"/>
-          <w:lang w:val="en-US"/>
-        </w:rPr>
-        <w:t>$log-&gt;warning("This is some warning.");</w:t>
-      </w:r>
-    </w:p>
-    <w:p>
-      <w:pPr>
-        <w:pStyle w:val="block-code"/>
-        <w:rPr>
-          <w:color w:themeColor="text1" w:themeTint="f2" w:val="0D0D0D"/>
-          <w:lang w:val="en-US"/>
-        </w:rPr>
-      </w:pPr>
-      <w:r>
-        <w:rPr>
-          <w:color w:themeColor="text1" w:themeTint="f2" w:val="0D0D0D"/>
-          <w:lang w:val="en-US"/>
-        </w:rPr>
-        <w:t>$log-&gt;notice("This is some notice.");</w:t>
-      </w:r>
-    </w:p>
-    <w:p>
-      <w:pPr>
-        <w:pStyle w:val="block-code"/>
-        <w:rPr>
-          <w:color w:themeColor="text1" w:themeTint="f2" w:val="0D0D0D"/>
-          <w:lang w:val="en-US"/>
-        </w:rPr>
-      </w:pPr>
-      <w:r>
-        <w:rPr>
-          <w:color w:themeColor="text1" w:themeTint="f2" w:val="0D0D0D"/>
-          <w:lang w:val="en-US"/>
-        </w:rPr>
-        <w:t>$log-&gt;info("This is some info.");</w:t>
-      </w:r>
-    </w:p>
-    <w:p>
-      <w:pPr>
-        <w:pStyle w:val="block-code"/>
-        <w:rPr>
-          <w:color w:themeColor="text1" w:themeTint="f2" w:val="0D0D0D"/>
-          <w:lang w:val="en-US"/>
-        </w:rPr>
-      </w:pPr>
-      <w:r>
-        <w:rPr>
-          <w:color w:themeColor="text1" w:themeTint="f2" w:val="0D0D0D"/>
-          <w:lang w:val="en-US"/>
-        </w:rPr>
-        <w:t>$log-&gt;debug("This is some debug.");</w:t>
-      </w:r>
-    </w:p>
-    <w:p>
-      <w:pPr>
-        <w:pStyle w:val="block-code"/>
-        <w:rPr>
-          <w:lang w:val="en-US"/>
-        </w:rPr>
-      </w:pPr>
-      <w:r>
-        <w:rPr>
-          <w:lang w:val="en-US"/>
-        </w:rPr>
-      </w:r>
-    </w:p>
-    <w:p>
-      <w:pPr>
-        <w:pStyle w:val="block-code"/>
-        <w:rPr>
-          <w:lang w:val="en-US"/>
-        </w:rPr>
-      </w:pPr>
-      <w:r>
-        <w:rPr>
-          <w:lang w:val="en-US"/>
-        </w:rPr>
-        <w:t>$duck = new \Akarczmarczyk\LabComposer\Duck();</w:t>
-      </w:r>
-    </w:p>
-    <w:p>
-      <w:pPr>
-        <w:pStyle w:val="block-code"/>
-        <w:rPr>
-          <w:lang w:val="en-US"/>
-        </w:rPr>
-      </w:pPr>
-      <w:r>
-        <w:rPr>
-          <w:lang w:val="en-US"/>
-        </w:rPr>
-        <w:t>$duck-&gt;quack();</w:t>
-      </w:r>
-    </w:p>
-    <w:p>
-      <w:pPr>
-        <w:pStyle w:val="block-code"/>
-        <w:rPr>
-          <w:lang w:val="en-US"/>
-        </w:rPr>
-      </w:pPr>
-      <w:r>
-        <w:rPr>
-          <w:lang w:val="en-US"/>
-        </w:rPr>
-        <w:t>$duck-&gt;quack();</w:t>
-      </w:r>
-    </w:p>
-    <w:p>
-      <w:pPr>
-        <w:pStyle w:val="block-code"/>
-        <w:rPr>
-          <w:lang w:val="en-US"/>
-        </w:rPr>
-      </w:pPr>
-      <w:r>
-        <w:rPr>
-          <w:lang w:val="en-US"/>
-        </w:rPr>
-        <w:t>$duck-&gt;quack();</w:t>
-      </w:r>
-    </w:p>
-    <w:p>
-      <w:pPr>
-        <w:pStyle w:val="Normal"/>
-        <w:rPr>
-          <w:lang w:val="pl-PL"/>
-        </w:rPr>
-      </w:pPr>
-      <w:r>
-        <w:rPr>
-          <w:lang w:val="pl-PL"/>
-        </w:rPr>
-        <w:t>Uruchom program:</w:t>
-      </w:r>
-    </w:p>
-    <w:p>
-      <w:pPr>
-        <w:pStyle w:val="block-code"/>
-        <w:rPr/>
-      </w:pPr>
-      <w:r>
-        <w:rPr/>
-        <w:t>php index.php</w:t>
-      </w:r>
-    </w:p>
-    <w:p>
-      <w:pPr>
-        <w:pStyle w:val="Normal"/>
-        <w:rPr>
-          <w:lang w:val="pl-PL"/>
-        </w:rPr>
-      </w:pPr>
-      <w:r>
-        <w:rPr>
-          <w:lang w:val="pl-PL"/>
-        </w:rPr>
-        <w:t xml:space="preserve">Sprawdź zawartość pliku </w:t>
-      </w:r>
-      <w:r>
-        <w:rPr>
-          <w:rStyle w:val="inline-code"/>
-        </w:rPr>
-        <w:t>monolog.log</w:t>
-      </w:r>
-      <w:r>
-        <w:rPr>
-          <w:lang w:val="pl-PL"/>
-        </w:rPr>
-        <w:t>.</w:t>
-      </w:r>
-    </w:p>
-    <w:p>
-      <w:pPr>
         <w:pStyle w:val="Zadanie"/>
         <w:rPr/>
       </w:pPr>
       <w:r>
         <w:rPr/>
-        <w:t xml:space="preserve">Kolejno zmieniaj </w:t>
-      </w:r>
-      <w:r>
-        <w:rPr>
-          <w:rStyle w:val="inline-code"/>
-        </w:rPr>
-        <w:t>Error</w:t>
-      </w:r>
-      <w:r>
-        <w:rPr/>
-        <w:t xml:space="preserve"> w kodzie na </w:t>
-      </w:r>
-      <w:r>
-        <w:rPr>
-          <w:rStyle w:val="inline-code"/>
-        </w:rPr>
-        <w:t>Warning</w:t>
-      </w:r>
-      <w:r>
-        <w:rPr/>
-        <w:t xml:space="preserve">, </w:t>
-      </w:r>
-      <w:r>
-        <w:rPr>
-          <w:rStyle w:val="inline-code"/>
-        </w:rPr>
-        <w:t>Notice</w:t>
-      </w:r>
-      <w:r>
-        <w:rPr/>
-        <w:t xml:space="preserve">, </w:t>
-      </w:r>
-      <w:r>
-        <w:rPr>
-          <w:rStyle w:val="inline-code"/>
-        </w:rPr>
-        <w:t>Info</w:t>
-      </w:r>
-      <w:r>
-        <w:rPr/>
-        <w:t xml:space="preserve"> i </w:t>
-      </w:r>
-      <w:r>
-        <w:rPr>
-          <w:rStyle w:val="inline-code"/>
-        </w:rPr>
-        <w:t>Debug</w:t>
-      </w:r>
-      <w:r>
-        <w:rPr/>
-        <w:t xml:space="preserve"> i uruchamiaj program. Omów wpływ zmiany na liczbę zapisywanych logów. Omów korzyści praktyczne płynące z umieszczania funkcji logujących w całym programie i przełączania poziomu logów w jednym miejscu.</w:t>
       </w:r>
     </w:p>
     <w:p>
@@ -5611,6 +6893,11 @@
       </w:pPr>
       <w:r>
         <w:rPr/>
+        <w:t>…</w:t>
+      </w:r>
+      <w:r>
+        <w:rPr/>
+        <w:t>wycinek monolog.log…</w:t>
       </w:r>
     </w:p>
     <w:p>
@@ -5620,63 +6907,20 @@
       </w:pPr>
       <w:r>
         <w:rPr/>
+      </w:r>
+    </w:p>
+    <w:p>
+      <w:pPr>
+        <w:pStyle w:val="Zadanie"/>
+        <w:rPr/>
+      </w:pPr>
+      <w:r>
+        <w:rPr/>
         <w:t>…</w:t>
       </w:r>
       <w:r>
         <w:rPr/>
         <w:t>omówienie…</w:t>
-      </w:r>
-    </w:p>
-    <w:p>
-      <w:pPr>
-        <w:pStyle w:val="Zadanie"/>
-        <w:rPr/>
-      </w:pPr>
-      <w:r>
-        <w:rPr/>
-      </w:r>
-    </w:p>
-    <w:p>
-      <w:pPr>
-        <w:pStyle w:val="Zadanie"/>
-        <w:rPr/>
-      </w:pPr>
-      <w:r>
-        <w:rPr/>
-        <w:t xml:space="preserve">Wstaw reprezentatywny fragment pliku </w:t>
-      </w:r>
-      <w:r>
-        <w:rPr>
-          <w:rStyle w:val="inline-code"/>
-        </w:rPr>
-        <w:t>monolog.log</w:t>
-      </w:r>
-      <w:r>
-        <w:rPr/>
-        <w:t>:</w:t>
-      </w:r>
-    </w:p>
-    <w:p>
-      <w:pPr>
-        <w:pStyle w:val="Zadanie"/>
-        <w:rPr/>
-      </w:pPr>
-      <w:r>
-        <w:rPr/>
-      </w:r>
-    </w:p>
-    <w:p>
-      <w:pPr>
-        <w:pStyle w:val="Zadanie"/>
-        <w:rPr/>
-      </w:pPr>
-      <w:r>
-        <w:rPr/>
-        <w:t>…</w:t>
-      </w:r>
-      <w:r>
-        <w:rPr/>
-        <w:t>wycinek monolog.log…</w:t>
       </w:r>
     </w:p>
     <w:tbl>
@@ -5684,7 +6928,7 @@
         <w:tblStyle w:val="Tabela-Siatka"/>
         <w:tblW w:w="5000" w:type="pct"/>
         <w:jc w:val="start"/>
-        <w:tblInd w:w="0" w:type="dxa"/>
+        <w:tblInd w:w="113" w:type="dxa"/>
         <w:tblLayout w:type="fixed"/>
         <w:tblCellMar>
           <w:top w:w="0" w:type="dxa"/>
@@ -5695,8 +6939,8 @@
         <w:tblLook w:val="04a0" w:firstRow="1" w:noVBand="1" w:lastRow="0" w:firstColumn="1" w:lastColumn="0" w:noHBand="0"/>
       </w:tblPr>
       <w:tblGrid>
-        <w:gridCol w:w="8194"/>
-        <w:gridCol w:w="1136"/>
+        <w:gridCol w:w="8193"/>
+        <w:gridCol w:w="1137"/>
         <w:gridCol w:w="1136"/>
       </w:tblGrid>
       <w:tr>
@@ -5705,7 +6949,7 @@
         </w:trPr>
         <w:tc>
           <w:tcPr>
-            <w:tcW w:w="8194" w:type="dxa"/>
+            <w:tcW w:w="8193" w:type="dxa"/>
             <w:tcBorders/>
             <w:vAlign w:val="center"/>
           </w:tcPr>
@@ -5738,1251 +6982,7 @@
         </w:tc>
         <w:tc>
           <w:tcPr>
-            <w:tcW w:w="1136" w:type="dxa"/>
-            <w:tcBorders/>
-            <w:vAlign w:val="center"/>
-          </w:tcPr>
-          <w:p>
-            <w:pPr>
-              <w:pStyle w:val="PunktyTabela"/>
-              <w:widowControl/>
-              <w:suppressAutoHyphens w:val="true"/>
-              <w:spacing w:before="0" w:after="0"/>
-              <w:jc w:val="center"/>
-              <w:rPr>
-                <w:rFonts w:ascii="Calibri" w:hAnsi="Calibri" w:eastAsia="Calibri" w:cs="Arial"/>
-                <w:kern w:val="2"/>
-                <w:sz w:val="22"/>
-                <w:szCs w:val="22"/>
-                <w:lang w:eastAsia="en-US" w:bidi="ar-SA"/>
-              </w:rPr>
-            </w:pPr>
-            <w:r>
-              <w:rPr>
-                <w:rFonts w:eastAsia="Calibri" w:cs="Arial"/>
-                <w:kern w:val="2"/>
-                <w:sz w:val="22"/>
-                <w:szCs w:val="22"/>
-                <w:lang w:eastAsia="en-US" w:bidi="ar-SA"/>
-              </w:rPr>
-              <w:t>0</w:t>
-            </w:r>
-          </w:p>
-        </w:tc>
-        <w:tc>
-          <w:tcPr>
-            <w:tcW w:w="1136" w:type="dxa"/>
-            <w:tcBorders/>
-            <w:vAlign w:val="center"/>
-          </w:tcPr>
-          <w:p>
-            <w:pPr>
-              <w:pStyle w:val="PunktyTabela"/>
-              <w:widowControl/>
-              <w:suppressAutoHyphens w:val="true"/>
-              <w:spacing w:before="0" w:after="0"/>
-              <w:jc w:val="center"/>
-              <w:rPr>
-                <w:rFonts w:ascii="Calibri" w:hAnsi="Calibri" w:eastAsia="Calibri" w:cs="Arial"/>
-                <w:kern w:val="2"/>
-                <w:sz w:val="22"/>
-                <w:szCs w:val="22"/>
-                <w:lang w:eastAsia="en-US" w:bidi="ar-SA"/>
-              </w:rPr>
-            </w:pPr>
-            <w:r>
-              <w:rPr>
-                <w:rFonts w:eastAsia="Calibri" w:cs="Arial"/>
-                <w:kern w:val="2"/>
-                <w:sz w:val="22"/>
-                <w:szCs w:val="22"/>
-                <w:lang w:eastAsia="en-US" w:bidi="ar-SA"/>
-              </w:rPr>
-              <w:t>1</w:t>
-            </w:r>
-          </w:p>
-        </w:tc>
-      </w:tr>
-    </w:tbl>
-    <w:p>
-      <w:pPr>
-        <w:pStyle w:val="Heading1"/>
-        <w:rPr/>
-      </w:pPr>
-      <w:bookmarkStart w:id="9" w:name="_Toc240323091"/>
-      <w:r>
-        <w:rPr/>
-        <w:t>Dependency Injection</w:t>
-      </w:r>
-      <w:bookmarkEnd w:id="9"/>
-    </w:p>
-    <w:p>
-      <w:pPr>
-        <w:pStyle w:val="Normal"/>
-        <w:rPr>
-          <w:lang w:val="pl-PL"/>
-        </w:rPr>
-      </w:pPr>
-      <w:r>
-        <w:rPr>
-          <w:lang w:val="pl-PL"/>
-        </w:rPr>
-        <w:t xml:space="preserve">Dependency injection to technika programistyczna wchodząca w skład architektury heksagonalnej, który umożliwia uniezależnienie klasy od jej zależności. W tej sekcji wstrzykniemy do klasy </w:t>
-      </w:r>
-      <w:r>
-        <w:rPr>
-          <w:rStyle w:val="inline-code"/>
-        </w:rPr>
-        <w:t>Duck</w:t>
-      </w:r>
-      <w:r>
-        <w:rPr>
-          <w:lang w:val="pl-PL"/>
-        </w:rPr>
-        <w:t xml:space="preserve"> loggera, aby można było logować zdarzenia w instancjach tej klasy.</w:t>
-      </w:r>
-    </w:p>
-    <w:p>
-      <w:pPr>
-        <w:pStyle w:val="Normal"/>
-        <w:rPr>
-          <w:lang w:val="pl-PL"/>
-        </w:rPr>
-      </w:pPr>
-      <w:r>
-        <w:rPr>
-          <w:lang w:val="pl-PL"/>
-        </w:rPr>
-        <w:t xml:space="preserve">Zmodyfikuj klasę </w:t>
-      </w:r>
-      <w:r>
-        <w:rPr>
-          <w:rStyle w:val="inline-code"/>
-        </w:rPr>
-        <w:t>Duck.php</w:t>
-      </w:r>
-      <w:r>
-        <w:rPr>
-          <w:lang w:val="pl-PL"/>
-        </w:rPr>
-        <w:t>, żeby:</w:t>
-      </w:r>
-    </w:p>
-    <w:p>
-      <w:pPr>
-        <w:pStyle w:val="ListParagraph"/>
-        <w:numPr>
-          <w:ilvl w:val="0"/>
-          <w:numId w:val="5"/>
-        </w:numPr>
-        <w:rPr>
-          <w:lang w:val="pl-PL"/>
-        </w:rPr>
-      </w:pPr>
-      <w:r>
-        <w:rPr>
-          <w:lang w:val="pl-PL"/>
-        </w:rPr>
-        <w:t xml:space="preserve">wykorzystywała technikę </w:t>
-      </w:r>
-      <w:r>
-        <w:rPr>
-          <w:rStyle w:val="inline-code"/>
-        </w:rPr>
-        <w:t>Dependency Injection</w:t>
-      </w:r>
-      <w:r>
-        <w:rPr>
-          <w:lang w:val="pl-PL"/>
-        </w:rPr>
-        <w:t xml:space="preserve"> do przekazywania obiektu klasy </w:t>
-      </w:r>
-      <w:r>
-        <w:rPr>
-          <w:rStyle w:val="inline-code"/>
-        </w:rPr>
-        <w:t>LoggerInterface</w:t>
-      </w:r>
-      <w:r>
-        <w:rPr>
-          <w:lang w:val="pl-PL"/>
-        </w:rPr>
-        <w:t>;</w:t>
-      </w:r>
-    </w:p>
-    <w:p>
-      <w:pPr>
-        <w:pStyle w:val="ListParagraph"/>
-        <w:numPr>
-          <w:ilvl w:val="0"/>
-          <w:numId w:val="5"/>
-        </w:numPr>
-        <w:rPr>
-          <w:lang w:val="pl-PL"/>
-        </w:rPr>
-      </w:pPr>
-      <w:r>
-        <w:rPr>
-          <w:lang w:val="pl-PL"/>
-        </w:rPr>
-        <w:t xml:space="preserve">logowała (poziom </w:t>
-      </w:r>
-      <w:r>
-        <w:rPr>
-          <w:rStyle w:val="inline-code"/>
-        </w:rPr>
-        <w:t>Info</w:t>
-      </w:r>
-      <w:r>
-        <w:rPr>
-          <w:lang w:val="pl-PL"/>
-        </w:rPr>
-        <w:t xml:space="preserve">) stworzenie klasy </w:t>
-      </w:r>
-      <w:r>
-        <w:rPr>
-          <w:rStyle w:val="inline-code"/>
-        </w:rPr>
-        <w:t>Duck</w:t>
-      </w:r>
-      <w:r>
-        <w:rPr>
-          <w:lang w:val="pl-PL"/>
-        </w:rPr>
-        <w:t>;</w:t>
-      </w:r>
-    </w:p>
-    <w:p>
-      <w:pPr>
-        <w:pStyle w:val="ListParagraph"/>
-        <w:numPr>
-          <w:ilvl w:val="0"/>
-          <w:numId w:val="5"/>
-        </w:numPr>
-        <w:rPr>
-          <w:lang w:val="pl-PL"/>
-        </w:rPr>
-      </w:pPr>
-      <w:r>
-        <w:rPr>
-          <w:lang w:val="pl-PL"/>
-        </w:rPr>
-        <w:t xml:space="preserve">logowała (poziom </w:t>
-      </w:r>
-      <w:r>
-        <w:rPr>
-          <w:rStyle w:val="inline-code"/>
-        </w:rPr>
-        <w:t>Debug</w:t>
-      </w:r>
-      <w:r>
-        <w:rPr>
-          <w:lang w:val="pl-PL"/>
-        </w:rPr>
-        <w:t xml:space="preserve">) wykonanie metody </w:t>
-      </w:r>
-      <w:r>
-        <w:rPr>
-          <w:rStyle w:val="inline-code"/>
-        </w:rPr>
-        <w:t>Duck::quack()</w:t>
-      </w:r>
-      <w:r>
-        <w:rPr>
-          <w:lang w:val="pl-PL"/>
-        </w:rPr>
-        <w:t>.</w:t>
-      </w:r>
-    </w:p>
-    <w:p>
-      <w:pPr>
-        <w:pStyle w:val="Normal"/>
-        <w:rPr>
-          <w:lang w:val="pl-PL"/>
-        </w:rPr>
-      </w:pPr>
-      <w:r>
-        <w:rPr>
-          <w:lang w:val="pl-PL"/>
-        </w:rPr>
-        <w:t xml:space="preserve">Następnie przetestuj uruchamianie kodu źródłowego z poziomami logowania </w:t>
-      </w:r>
-      <w:r>
-        <w:rPr>
-          <w:rStyle w:val="inline-code"/>
-        </w:rPr>
-        <w:t>ERROR</w:t>
-      </w:r>
-      <w:r>
-        <w:rPr>
-          <w:lang w:val="pl-PL"/>
-        </w:rPr>
-        <w:t xml:space="preserve">, </w:t>
-      </w:r>
-      <w:r>
-        <w:rPr>
-          <w:rStyle w:val="inline-code"/>
-        </w:rPr>
-        <w:t>WARNING</w:t>
-      </w:r>
-      <w:r>
-        <w:rPr>
-          <w:lang w:val="pl-PL"/>
-        </w:rPr>
-        <w:t xml:space="preserve">, </w:t>
-      </w:r>
-      <w:r>
-        <w:rPr>
-          <w:rStyle w:val="inline-code"/>
-        </w:rPr>
-        <w:t>INFO</w:t>
-      </w:r>
-      <w:r>
-        <w:rPr>
-          <w:lang w:val="pl-PL"/>
-        </w:rPr>
-        <w:t xml:space="preserve">, </w:t>
-      </w:r>
-      <w:r>
-        <w:rPr>
-          <w:rStyle w:val="inline-code"/>
-        </w:rPr>
-        <w:t>DEBUG</w:t>
-      </w:r>
-      <w:r>
-        <w:rPr>
-          <w:lang w:val="pl-PL"/>
-        </w:rPr>
-        <w:t>.</w:t>
-      </w:r>
-    </w:p>
-    <w:p>
-      <w:pPr>
-        <w:pStyle w:val="block-code"/>
-        <w:rPr/>
-      </w:pPr>
-      <w:r>
-        <w:rPr/>
-        <w:t>&lt;?php // src/Duck.php</w:t>
-      </w:r>
-    </w:p>
-    <w:p>
-      <w:pPr>
-        <w:pStyle w:val="block-code"/>
-        <w:rPr/>
-      </w:pPr>
-      <w:r>
-        <w:rPr/>
-        <w:t>namespace Akarczmarczyk\LabComposer;</w:t>
-      </w:r>
-    </w:p>
-    <w:p>
-      <w:pPr>
-        <w:pStyle w:val="block-code"/>
-        <w:rPr/>
-      </w:pPr>
-      <w:r>
-        <w:rPr/>
-      </w:r>
-    </w:p>
-    <w:p>
-      <w:pPr>
-        <w:pStyle w:val="block-code"/>
-        <w:rPr>
-          <w:color w:themeColor="text1" w:themeTint="f2" w:val="0D0D0D"/>
-          <w:lang w:val="en-US"/>
-        </w:rPr>
-      </w:pPr>
-      <w:r>
-        <w:rPr>
-          <w:color w:themeColor="text1" w:themeTint="f2" w:val="0D0D0D"/>
-          <w:lang w:val="en-US"/>
-        </w:rPr>
-        <w:t>use Psr\Log\LoggerInterface;</w:t>
-      </w:r>
-    </w:p>
-    <w:p>
-      <w:pPr>
-        <w:pStyle w:val="block-code"/>
-        <w:rPr>
-          <w:lang w:val="en-US"/>
-        </w:rPr>
-      </w:pPr>
-      <w:r>
-        <w:rPr>
-          <w:lang w:val="en-US"/>
-        </w:rPr>
-      </w:r>
-    </w:p>
-    <w:p>
-      <w:pPr>
-        <w:pStyle w:val="block-code"/>
-        <w:rPr>
-          <w:lang w:val="en-US"/>
-        </w:rPr>
-      </w:pPr>
-      <w:r>
-        <w:rPr>
-          <w:lang w:val="en-US"/>
-        </w:rPr>
-        <w:t>class Duck</w:t>
-      </w:r>
-    </w:p>
-    <w:p>
-      <w:pPr>
-        <w:pStyle w:val="block-code"/>
-        <w:rPr>
-          <w:lang w:val="en-US"/>
-        </w:rPr>
-      </w:pPr>
-      <w:r>
-        <w:rPr>
-          <w:lang w:val="en-US"/>
-        </w:rPr>
-        <w:t>{</w:t>
-      </w:r>
-    </w:p>
-    <w:p>
-      <w:pPr>
-        <w:pStyle w:val="block-code"/>
-        <w:rPr>
-          <w:color w:themeColor="text1" w:themeTint="f2" w:val="0D0D0D"/>
-          <w:lang w:val="en-US"/>
-        </w:rPr>
-      </w:pPr>
-      <w:r>
-        <w:rPr>
-          <w:color w:themeColor="text1" w:themeTint="f2" w:val="0D0D0D"/>
-          <w:lang w:val="en-US"/>
-        </w:rPr>
-        <w:t xml:space="preserve">    </w:t>
-      </w:r>
-      <w:r>
-        <w:rPr>
-          <w:color w:themeColor="text1" w:themeTint="f2" w:val="0D0D0D"/>
-          <w:lang w:val="en-US"/>
-        </w:rPr>
-        <w:t>/** @var LoggerInterface */</w:t>
-      </w:r>
-    </w:p>
-    <w:p>
-      <w:pPr>
-        <w:pStyle w:val="block-code"/>
-        <w:rPr>
-          <w:color w:themeColor="text1" w:themeTint="f2" w:val="0D0D0D"/>
-          <w:lang w:val="en-US"/>
-        </w:rPr>
-      </w:pPr>
-      <w:r>
-        <w:rPr>
-          <w:color w:themeColor="text1" w:themeTint="f2" w:val="0D0D0D"/>
-          <w:lang w:val="en-US"/>
-        </w:rPr>
-        <w:t xml:space="preserve">    </w:t>
-      </w:r>
-      <w:r>
-        <w:rPr>
-          <w:color w:themeColor="text1" w:themeTint="f2" w:val="0D0D0D"/>
-          <w:lang w:val="en-US"/>
-        </w:rPr>
-        <w:t>private $logger;</w:t>
-      </w:r>
-    </w:p>
-    <w:p>
-      <w:pPr>
-        <w:pStyle w:val="block-code"/>
-        <w:rPr>
-          <w:color w:themeColor="text1" w:themeTint="f2" w:val="0D0D0D"/>
-          <w:lang w:val="en-US"/>
-        </w:rPr>
-      </w:pPr>
-      <w:r>
-        <w:rPr>
-          <w:color w:themeColor="text1" w:themeTint="f2" w:val="0D0D0D"/>
-          <w:lang w:val="en-US"/>
-        </w:rPr>
-      </w:r>
-    </w:p>
-    <w:p>
-      <w:pPr>
-        <w:pStyle w:val="block-code"/>
-        <w:rPr>
-          <w:color w:themeColor="text1" w:themeTint="f2" w:val="0D0D0D"/>
-          <w:lang w:val="en-US"/>
-        </w:rPr>
-      </w:pPr>
-      <w:r>
-        <w:rPr>
-          <w:color w:themeColor="text1" w:themeTint="f2" w:val="0D0D0D"/>
-          <w:lang w:val="en-US"/>
-        </w:rPr>
-        <w:t xml:space="preserve">    </w:t>
-      </w:r>
-      <w:r>
-        <w:rPr>
-          <w:color w:themeColor="text1" w:themeTint="f2" w:val="0D0D0D"/>
-          <w:lang w:val="en-US"/>
-        </w:rPr>
-        <w:t>public function __construct(?LoggerInterface $logger = null)</w:t>
-      </w:r>
-    </w:p>
-    <w:p>
-      <w:pPr>
-        <w:pStyle w:val="block-code"/>
-        <w:rPr>
-          <w:color w:themeColor="text1" w:themeTint="f2" w:val="0D0D0D"/>
-          <w:lang w:val="en-US"/>
-        </w:rPr>
-      </w:pPr>
-      <w:r>
-        <w:rPr>
-          <w:color w:themeColor="text1" w:themeTint="f2" w:val="0D0D0D"/>
-          <w:lang w:val="en-US"/>
-        </w:rPr>
-        <w:t xml:space="preserve">    </w:t>
-      </w:r>
-      <w:r>
-        <w:rPr>
-          <w:color w:themeColor="text1" w:themeTint="f2" w:val="0D0D0D"/>
-          <w:lang w:val="en-US"/>
-        </w:rPr>
-        <w:t>{</w:t>
-      </w:r>
-    </w:p>
-    <w:p>
-      <w:pPr>
-        <w:pStyle w:val="block-code"/>
-        <w:rPr>
-          <w:color w:themeColor="text1" w:themeTint="f2" w:val="0D0D0D"/>
-          <w:lang w:val="en-US"/>
-        </w:rPr>
-      </w:pPr>
-      <w:r>
-        <w:rPr>
-          <w:color w:themeColor="text1" w:themeTint="f2" w:val="0D0D0D"/>
-          <w:lang w:val="en-US"/>
-        </w:rPr>
-        <w:t xml:space="preserve">        </w:t>
-      </w:r>
-      <w:r>
-        <w:rPr>
-          <w:color w:themeColor="text1" w:themeTint="f2" w:val="0D0D0D"/>
-          <w:lang w:val="en-US"/>
-        </w:rPr>
-        <w:t>$this-&gt;logger = $logger;</w:t>
-      </w:r>
-    </w:p>
-    <w:p>
-      <w:pPr>
-        <w:pStyle w:val="block-code"/>
-        <w:rPr>
-          <w:color w:themeColor="text1" w:themeTint="f2" w:val="0D0D0D"/>
-          <w:lang w:val="en-US"/>
-        </w:rPr>
-      </w:pPr>
-      <w:r>
-        <w:rPr>
-          <w:color w:themeColor="text1" w:themeTint="f2" w:val="0D0D0D"/>
-          <w:lang w:val="en-US"/>
-        </w:rPr>
-        <w:t xml:space="preserve">        </w:t>
-      </w:r>
-      <w:r>
-        <w:rPr>
-          <w:color w:themeColor="text1" w:themeTint="f2" w:val="0D0D0D"/>
-          <w:lang w:val="en-US"/>
-        </w:rPr>
-        <w:t>if ($this-&gt;logger) {</w:t>
-      </w:r>
-    </w:p>
-    <w:p>
-      <w:pPr>
-        <w:pStyle w:val="block-code"/>
-        <w:rPr>
-          <w:color w:themeColor="text1" w:themeTint="f2" w:val="0D0D0D"/>
-          <w:lang w:val="en-US"/>
-        </w:rPr>
-      </w:pPr>
-      <w:r>
-        <w:rPr>
-          <w:color w:themeColor="text1" w:themeTint="f2" w:val="0D0D0D"/>
-          <w:lang w:val="en-US"/>
-        </w:rPr>
-        <w:t xml:space="preserve">            </w:t>
-      </w:r>
-      <w:r>
-        <w:rPr>
-          <w:color w:themeColor="text1" w:themeTint="f2" w:val="0D0D0D"/>
-          <w:lang w:val="en-US"/>
-        </w:rPr>
-        <w:t>$this-&gt;logger-&gt;info("Duck created.");</w:t>
-      </w:r>
-    </w:p>
-    <w:p>
-      <w:pPr>
-        <w:pStyle w:val="block-code"/>
-        <w:rPr>
-          <w:color w:themeColor="text1" w:themeTint="f2" w:val="0D0D0D"/>
-          <w:lang w:val="en-US"/>
-        </w:rPr>
-      </w:pPr>
-      <w:r>
-        <w:rPr>
-          <w:color w:themeColor="text1" w:themeTint="f2" w:val="0D0D0D"/>
-          <w:lang w:val="en-US"/>
-        </w:rPr>
-        <w:t xml:space="preserve">        </w:t>
-      </w:r>
-      <w:r>
-        <w:rPr>
-          <w:color w:themeColor="text1" w:themeTint="f2" w:val="0D0D0D"/>
-          <w:lang w:val="en-US"/>
-        </w:rPr>
-        <w:t>}</w:t>
-      </w:r>
-    </w:p>
-    <w:p>
-      <w:pPr>
-        <w:pStyle w:val="block-code"/>
-        <w:rPr>
-          <w:color w:themeColor="text1" w:themeTint="f2" w:val="0D0D0D"/>
-          <w:lang w:val="en-US"/>
-        </w:rPr>
-      </w:pPr>
-      <w:r>
-        <w:rPr>
-          <w:color w:themeColor="text1" w:themeTint="f2" w:val="0D0D0D"/>
-          <w:lang w:val="en-US"/>
-        </w:rPr>
-        <w:t xml:space="preserve">    </w:t>
-      </w:r>
-      <w:r>
-        <w:rPr>
-          <w:color w:themeColor="text1" w:themeTint="f2" w:val="0D0D0D"/>
-          <w:lang w:val="en-US"/>
-        </w:rPr>
-        <w:t>}</w:t>
-      </w:r>
-    </w:p>
-    <w:p>
-      <w:pPr>
-        <w:pStyle w:val="block-code"/>
-        <w:rPr>
-          <w:lang w:val="en-US"/>
-        </w:rPr>
-      </w:pPr>
-      <w:r>
-        <w:rPr>
-          <w:lang w:val="en-US"/>
-        </w:rPr>
-      </w:r>
-    </w:p>
-    <w:p>
-      <w:pPr>
-        <w:pStyle w:val="block-code"/>
-        <w:rPr>
-          <w:lang w:val="en-US"/>
-        </w:rPr>
-      </w:pPr>
-      <w:r>
-        <w:rPr>
-          <w:lang w:val="en-US"/>
-        </w:rPr>
-        <w:t xml:space="preserve">    </w:t>
-      </w:r>
-      <w:r>
-        <w:rPr>
-          <w:lang w:val="en-US"/>
-        </w:rPr>
-        <w:t>public function quack()</w:t>
-      </w:r>
-    </w:p>
-    <w:p>
-      <w:pPr>
-        <w:pStyle w:val="block-code"/>
-        <w:rPr>
-          <w:lang w:val="en-US"/>
-        </w:rPr>
-      </w:pPr>
-      <w:r>
-        <w:rPr>
-          <w:lang w:val="en-US"/>
-        </w:rPr>
-        <w:t xml:space="preserve">    </w:t>
-      </w:r>
-      <w:r>
-        <w:rPr>
-          <w:lang w:val="en-US"/>
-        </w:rPr>
-        <w:t>{</w:t>
-      </w:r>
-    </w:p>
-    <w:p>
-      <w:pPr>
-        <w:pStyle w:val="block-code"/>
-        <w:rPr>
-          <w:color w:themeColor="text1" w:themeTint="f2" w:val="0D0D0D"/>
-          <w:lang w:val="en-US"/>
-        </w:rPr>
-      </w:pPr>
-      <w:r>
-        <w:rPr>
-          <w:color w:themeColor="text1" w:themeTint="f2" w:val="0D0D0D"/>
-          <w:lang w:val="en-US"/>
-        </w:rPr>
-        <w:t xml:space="preserve">        </w:t>
-      </w:r>
-      <w:r>
-        <w:rPr>
-          <w:color w:themeColor="text1" w:themeTint="f2" w:val="0D0D0D"/>
-          <w:lang w:val="en-US"/>
-        </w:rPr>
-        <w:t>if ($this-&gt;logger) {</w:t>
-      </w:r>
-    </w:p>
-    <w:p>
-      <w:pPr>
-        <w:pStyle w:val="block-code"/>
-        <w:rPr>
-          <w:color w:themeColor="text1" w:themeTint="f2" w:val="0D0D0D"/>
-          <w:lang w:val="en-US"/>
-        </w:rPr>
-      </w:pPr>
-      <w:r>
-        <w:rPr>
-          <w:color w:themeColor="text1" w:themeTint="f2" w:val="0D0D0D"/>
-          <w:lang w:val="en-US"/>
-        </w:rPr>
-        <w:t xml:space="preserve">            </w:t>
-      </w:r>
-      <w:r>
-        <w:rPr>
-          <w:color w:themeColor="text1" w:themeTint="f2" w:val="0D0D0D"/>
-          <w:lang w:val="en-US"/>
-        </w:rPr>
-        <w:t>$this-&gt;logger-&gt;debug("Quack() executed.");</w:t>
-      </w:r>
-    </w:p>
-    <w:p>
-      <w:pPr>
-        <w:pStyle w:val="block-code"/>
-        <w:rPr>
-          <w:color w:themeColor="text1" w:themeTint="f2" w:val="0D0D0D"/>
-          <w:lang w:val="en-US"/>
-        </w:rPr>
-      </w:pPr>
-      <w:r>
-        <w:rPr>
-          <w:color w:themeColor="text1" w:themeTint="f2" w:val="0D0D0D"/>
-          <w:lang w:val="en-US"/>
-        </w:rPr>
-        <w:t xml:space="preserve">        </w:t>
-      </w:r>
-      <w:r>
-        <w:rPr>
-          <w:color w:themeColor="text1" w:themeTint="f2" w:val="0D0D0D"/>
-          <w:lang w:val="en-US"/>
-        </w:rPr>
-        <w:t>}</w:t>
-      </w:r>
-    </w:p>
-    <w:p>
-      <w:pPr>
-        <w:pStyle w:val="block-code"/>
-        <w:rPr>
-          <w:lang w:val="en-US"/>
-        </w:rPr>
-      </w:pPr>
-      <w:r>
-        <w:rPr>
-          <w:lang w:val="en-US"/>
-        </w:rPr>
-        <w:t xml:space="preserve">        </w:t>
-      </w:r>
-      <w:r>
-        <w:rPr>
-          <w:lang w:val="en-US"/>
-        </w:rPr>
-        <w:t>echo "Quack\n";</w:t>
-      </w:r>
-    </w:p>
-    <w:p>
-      <w:pPr>
-        <w:pStyle w:val="block-code"/>
-        <w:rPr>
-          <w:lang w:val="en-US"/>
-        </w:rPr>
-      </w:pPr>
-      <w:r>
-        <w:rPr>
-          <w:lang w:val="en-US"/>
-        </w:rPr>
-        <w:t xml:space="preserve">    </w:t>
-      </w:r>
-      <w:r>
-        <w:rPr>
-          <w:lang w:val="en-US"/>
-        </w:rPr>
-        <w:t>}</w:t>
-      </w:r>
-    </w:p>
-    <w:p>
-      <w:pPr>
-        <w:pStyle w:val="block-code"/>
-        <w:rPr>
-          <w:lang w:val="en-US"/>
-        </w:rPr>
-      </w:pPr>
-      <w:r>
-        <w:rPr>
-          <w:lang w:val="en-US"/>
-        </w:rPr>
-        <w:t>}</w:t>
-      </w:r>
-    </w:p>
-    <w:p>
-      <w:pPr>
-        <w:pStyle w:val="Normal"/>
-        <w:rPr/>
-      </w:pPr>
-      <w:r>
-        <w:rPr/>
-      </w:r>
-    </w:p>
-    <w:p>
-      <w:pPr>
-        <w:pStyle w:val="block-code"/>
-        <w:rPr>
-          <w:lang w:val="en-US"/>
-        </w:rPr>
-      </w:pPr>
-      <w:r>
-        <w:rPr>
-          <w:lang w:val="en-US"/>
-        </w:rPr>
-        <w:t>&lt;?php // index.php</w:t>
-      </w:r>
-    </w:p>
-    <w:p>
-      <w:pPr>
-        <w:pStyle w:val="block-code"/>
-        <w:rPr>
-          <w:lang w:val="en-US"/>
-        </w:rPr>
-      </w:pPr>
-      <w:r>
-        <w:rPr>
-          <w:lang w:val="en-US"/>
-        </w:rPr>
-        <w:t>require_once __DIR__ . '/vendor/autoload.php';</w:t>
-      </w:r>
-    </w:p>
-    <w:p>
-      <w:pPr>
-        <w:pStyle w:val="block-code"/>
-        <w:rPr>
-          <w:lang w:val="en-US"/>
-        </w:rPr>
-      </w:pPr>
-      <w:r>
-        <w:rPr>
-          <w:lang w:val="en-US"/>
-        </w:rPr>
-      </w:r>
-    </w:p>
-    <w:p>
-      <w:pPr>
-        <w:pStyle w:val="block-code"/>
-        <w:rPr>
-          <w:lang w:val="en-US"/>
-        </w:rPr>
-      </w:pPr>
-      <w:r>
-        <w:rPr>
-          <w:lang w:val="en-US"/>
-        </w:rPr>
-        <w:t>$ds = DIRECTORY_SEPARATOR;</w:t>
-      </w:r>
-    </w:p>
-    <w:p>
-      <w:pPr>
-        <w:pStyle w:val="block-code"/>
-        <w:rPr>
-          <w:lang w:val="en-US"/>
-        </w:rPr>
-      </w:pPr>
-      <w:r>
-        <w:rPr>
-          <w:lang w:val="en-US"/>
-        </w:rPr>
-        <w:t>$log = new \Monolog\Logger("my_log");</w:t>
-      </w:r>
-    </w:p>
-    <w:p>
-      <w:pPr>
-        <w:pStyle w:val="block-code"/>
-        <w:rPr>
-          <w:lang w:val="es-ES"/>
-        </w:rPr>
-      </w:pPr>
-      <w:r>
-        <w:rPr>
-          <w:lang w:val="en-US"/>
-        </w:rPr>
-        <w:t xml:space="preserve">$log-&gt;pushHandler(new \Monolog\Handler\StreamHandler(__DIR__ . </w:t>
-      </w:r>
-      <w:r>
-        <w:rPr>
-          <w:lang w:val="es-ES"/>
-        </w:rPr>
-        <w:t>$ds . 'monolog.log', \Monolog\</w:t>
-      </w:r>
-      <w:r>
-        <w:rPr>
-          <w:highlight w:val="yellow"/>
-          <w:lang w:val="es-ES"/>
-        </w:rPr>
-        <w:t>Level::Error</w:t>
-      </w:r>
-      <w:r>
-        <w:rPr>
-          <w:lang w:val="es-ES"/>
-        </w:rPr>
-        <w:t>));</w:t>
-      </w:r>
-    </w:p>
-    <w:p>
-      <w:pPr>
-        <w:pStyle w:val="block-code"/>
-        <w:rPr>
-          <w:lang w:val="en-US"/>
-        </w:rPr>
-      </w:pPr>
-      <w:r>
-        <w:rPr>
-          <w:lang w:val="en-US"/>
-        </w:rPr>
-        <w:t>$log-&gt;error("error");</w:t>
-      </w:r>
-    </w:p>
-    <w:p>
-      <w:pPr>
-        <w:pStyle w:val="block-code"/>
-        <w:rPr>
-          <w:lang w:val="en-US"/>
-        </w:rPr>
-      </w:pPr>
-      <w:r>
-        <w:rPr>
-          <w:lang w:val="en-US"/>
-        </w:rPr>
-        <w:t>$log-&gt;warning("warning");</w:t>
-      </w:r>
-    </w:p>
-    <w:p>
-      <w:pPr>
-        <w:pStyle w:val="block-code"/>
-        <w:rPr>
-          <w:lang w:val="en-US"/>
-        </w:rPr>
-      </w:pPr>
-      <w:r>
-        <w:rPr>
-          <w:lang w:val="en-US"/>
-        </w:rPr>
-      </w:r>
-    </w:p>
-    <w:p>
-      <w:pPr>
-        <w:pStyle w:val="block-code"/>
-        <w:rPr>
-          <w:lang w:val="en-US"/>
-        </w:rPr>
-      </w:pPr>
-      <w:r>
-        <w:rPr>
-          <w:lang w:val="en-US"/>
-        </w:rPr>
-        <w:t>$duck = new \Akarczmarczyk\LabComposer\Duck(</w:t>
-      </w:r>
-      <w:r>
-        <w:rPr>
-          <w:highlight w:val="green"/>
-          <w:lang w:val="en-US"/>
-        </w:rPr>
-        <w:t>$log</w:t>
-      </w:r>
-      <w:r>
-        <w:rPr>
-          <w:lang w:val="en-US"/>
-        </w:rPr>
-        <w:t>);</w:t>
-      </w:r>
-    </w:p>
-    <w:p>
-      <w:pPr>
-        <w:pStyle w:val="block-code"/>
-        <w:rPr>
-          <w:lang w:val="en-US"/>
-        </w:rPr>
-      </w:pPr>
-      <w:r>
-        <w:rPr>
-          <w:lang w:val="en-US"/>
-        </w:rPr>
-        <w:t>$duck-&gt;quack();</w:t>
-      </w:r>
-    </w:p>
-    <w:p>
-      <w:pPr>
-        <w:pStyle w:val="block-code"/>
-        <w:rPr>
-          <w:lang w:val="en-US"/>
-        </w:rPr>
-      </w:pPr>
-      <w:r>
-        <w:rPr>
-          <w:lang w:val="en-US"/>
-        </w:rPr>
-        <w:t>$duck-&gt;quack();</w:t>
-      </w:r>
-    </w:p>
-    <w:p>
-      <w:pPr>
-        <w:pStyle w:val="block-code"/>
-        <w:rPr>
-          <w:lang w:val="en-US"/>
-        </w:rPr>
-      </w:pPr>
-      <w:r>
-        <w:rPr>
-          <w:lang w:val="en-US"/>
-        </w:rPr>
-        <w:t>$duck-&gt;quack();</w:t>
-      </w:r>
-    </w:p>
-    <w:p>
-      <w:pPr>
-        <w:pStyle w:val="Normal"/>
-        <w:rPr>
-          <w:lang w:val="pl-PL"/>
-        </w:rPr>
-      </w:pPr>
-      <w:r>
-        <w:rPr>
-          <w:b/>
-          <w:bCs/>
-          <w:lang w:val="pl-PL"/>
-        </w:rPr>
-        <w:t xml:space="preserve">Nie działa? </w:t>
-      </w:r>
-      <w:r>
-        <w:rPr>
-          <w:lang w:val="pl-PL"/>
-        </w:rPr>
-        <w:t xml:space="preserve">Upewnij się, że do wywołania konstruktora </w:t>
-      </w:r>
-      <w:r>
-        <w:rPr>
-          <w:rStyle w:val="inline-code"/>
-        </w:rPr>
-        <w:t>Duck(…)</w:t>
-      </w:r>
-      <w:r>
-        <w:rPr>
-          <w:lang w:val="pl-PL"/>
-        </w:rPr>
-        <w:t xml:space="preserve"> przekazano </w:t>
-      </w:r>
-      <w:r>
-        <w:rPr>
-          <w:rStyle w:val="inline-code"/>
-        </w:rPr>
-        <w:t>$log</w:t>
-      </w:r>
-      <w:r>
-        <w:rPr>
-          <w:lang w:val="pl-PL"/>
-        </w:rPr>
-        <w:t>.</w:t>
-      </w:r>
-    </w:p>
-    <w:p>
-      <w:pPr>
-        <w:pStyle w:val="Zadanie"/>
-        <w:rPr/>
-      </w:pPr>
-      <w:r>
-        <w:rPr/>
-        <w:t xml:space="preserve">Kolejno zmieniaj </w:t>
-      </w:r>
-      <w:r>
-        <w:rPr>
-          <w:rStyle w:val="inline-code"/>
-        </w:rPr>
-        <w:t>Error</w:t>
-      </w:r>
-      <w:r>
-        <w:rPr/>
-        <w:t xml:space="preserve"> w kodzie na </w:t>
-      </w:r>
-      <w:r>
-        <w:rPr>
-          <w:rStyle w:val="inline-code"/>
-        </w:rPr>
-        <w:t>Warning</w:t>
-      </w:r>
-      <w:r>
-        <w:rPr/>
-        <w:t xml:space="preserve">, </w:t>
-      </w:r>
-      <w:r>
-        <w:rPr>
-          <w:rStyle w:val="inline-code"/>
-        </w:rPr>
-        <w:t>Notice</w:t>
-      </w:r>
-      <w:r>
-        <w:rPr/>
-        <w:t xml:space="preserve">, </w:t>
-      </w:r>
-      <w:r>
-        <w:rPr>
-          <w:rStyle w:val="inline-code"/>
-        </w:rPr>
-        <w:t>Info</w:t>
-      </w:r>
-      <w:r>
-        <w:rPr/>
-        <w:t xml:space="preserve"> i </w:t>
-      </w:r>
-      <w:r>
-        <w:rPr>
-          <w:rStyle w:val="inline-code"/>
-        </w:rPr>
-        <w:t>Debug</w:t>
-      </w:r>
-      <w:r>
-        <w:rPr/>
-        <w:t xml:space="preserve"> i uruchamiaj program. Omów wpływ zmiany na liczbę zapisywanych logów. Zamieść odpowiedni wycinek pliku </w:t>
-      </w:r>
-      <w:r>
-        <w:rPr>
-          <w:rStyle w:val="inline-code"/>
-        </w:rPr>
-        <w:t>monolog.log</w:t>
-      </w:r>
-      <w:r>
-        <w:rPr/>
-        <w:t>:</w:t>
-      </w:r>
-    </w:p>
-    <w:p>
-      <w:pPr>
-        <w:pStyle w:val="Zadanie"/>
-        <w:rPr/>
-      </w:pPr>
-      <w:r>
-        <w:rPr/>
-      </w:r>
-    </w:p>
-    <w:p>
-      <w:pPr>
-        <w:pStyle w:val="Zadanie"/>
-        <w:rPr/>
-      </w:pPr>
-      <w:r>
-        <w:rPr/>
-        <w:t>…</w:t>
-      </w:r>
-      <w:r>
-        <w:rPr/>
-        <w:t>wycinek monolog.log…</w:t>
-      </w:r>
-    </w:p>
-    <w:p>
-      <w:pPr>
-        <w:pStyle w:val="Zadanie"/>
-        <w:rPr/>
-      </w:pPr>
-      <w:r>
-        <w:rPr/>
-      </w:r>
-    </w:p>
-    <w:p>
-      <w:pPr>
-        <w:pStyle w:val="Zadanie"/>
-        <w:rPr/>
-      </w:pPr>
-      <w:r>
-        <w:rPr/>
-        <w:t>…</w:t>
-      </w:r>
-      <w:r>
-        <w:rPr/>
-        <w:t>omówienie…</w:t>
-      </w:r>
-    </w:p>
-    <w:tbl>
-      <w:tblPr>
-        <w:tblStyle w:val="Tabela-Siatka"/>
-        <w:tblW w:w="5000" w:type="pct"/>
-        <w:jc w:val="start"/>
-        <w:tblInd w:w="0" w:type="dxa"/>
-        <w:tblLayout w:type="fixed"/>
-        <w:tblCellMar>
-          <w:top w:w="0" w:type="dxa"/>
-          <w:start w:w="108" w:type="dxa"/>
-          <w:bottom w:w="0" w:type="dxa"/>
-          <w:end w:w="108" w:type="dxa"/>
-        </w:tblCellMar>
-        <w:tblLook w:val="04a0" w:firstRow="1" w:noVBand="1" w:lastRow="0" w:firstColumn="1" w:lastColumn="0" w:noHBand="0"/>
-      </w:tblPr>
-      <w:tblGrid>
-        <w:gridCol w:w="8194"/>
-        <w:gridCol w:w="1136"/>
-        <w:gridCol w:w="1136"/>
-      </w:tblGrid>
-      <w:tr>
-        <w:trPr>
-          <w:trHeight w:val="567" w:hRule="exact"/>
-        </w:trPr>
-        <w:tc>
-          <w:tcPr>
-            <w:tcW w:w="8194" w:type="dxa"/>
-            <w:tcBorders/>
-            <w:vAlign w:val="center"/>
-          </w:tcPr>
-          <w:p>
-            <w:pPr>
-              <w:pStyle w:val="PunktyTabela"/>
-              <w:widowControl/>
-              <w:suppressAutoHyphens w:val="true"/>
-              <w:spacing w:before="0" w:after="0"/>
-              <w:jc w:val="start"/>
-              <w:rPr>
-                <w:rFonts w:ascii="Calibri" w:hAnsi="Calibri" w:eastAsia="Calibri" w:cs="Arial"/>
-                <w:kern w:val="2"/>
-                <w:sz w:val="22"/>
-                <w:szCs w:val="22"/>
-                <w:lang w:eastAsia="en-US" w:bidi="ar-SA"/>
-              </w:rPr>
-            </w:pPr>
-            <w:r>
-              <w:rPr>
-                <w:rFonts w:eastAsia="Calibri" w:cs="Arial"/>
-                <w:kern w:val="2"/>
-                <w:sz w:val="22"/>
-                <w:szCs w:val="22"/>
-                <w:lang w:eastAsia="en-US" w:bidi="ar-SA"/>
-              </w:rPr>
-              <w:t>Punkty:</w:t>
-            </w:r>
-          </w:p>
-        </w:tc>
-        <w:tc>
-          <w:tcPr>
-            <w:tcW w:w="1136" w:type="dxa"/>
+            <w:tcW w:w="1137" w:type="dxa"/>
             <w:tcBorders/>
             <w:vAlign w:val="center"/>
           </w:tcPr>
@@ -9016,13 +9016,13 @@
       <w:lang w:val="pl-PL"/>
     </w:rPr>
   </w:style>
-  <w:style w:type="character" w:styleId="czeindeksuuser">
-    <w:name w:val="Łącze indeksu (user)"/>
+  <w:style w:type="character" w:styleId="czeindeksu">
+    <w:name w:val="Łącze indeksu"/>
     <w:qFormat/>
     <w:rPr/>
   </w:style>
-  <w:style w:type="character" w:styleId="czeindeksu">
-    <w:name w:val="Łącze indeksu"/>
+  <w:style w:type="character" w:styleId="czeindeksuuser">
+    <w:name w:val="Łącze indeksu (user)"/>
     <w:qFormat/>
     <w:rPr/>
   </w:style>
@@ -9110,15 +9110,15 @@
       <w:rFonts w:cs="Arial"/>
     </w:rPr>
   </w:style>
-  <w:style w:type="paragraph" w:styleId="Gwkaistopkauser">
-    <w:name w:val="Główka i stopka (user)"/>
+  <w:style w:type="paragraph" w:styleId="Gwkaistopka">
+    <w:name w:val="Główka i stopka"/>
     <w:basedOn w:val="Normal"/>
     <w:qFormat/>
     <w:pPr/>
     <w:rPr/>
   </w:style>
-  <w:style w:type="paragraph" w:styleId="Gwkaistopka">
-    <w:name w:val="Główka i stopka"/>
+  <w:style w:type="paragraph" w:styleId="Gwkaistopkauser">
+    <w:name w:val="Główka i stopka (user)"/>
     <w:basedOn w:val="Normal"/>
     <w:qFormat/>
     <w:pPr/>
@@ -9283,8 +9283,8 @@
       <w:lang w:val="pl-PL"/>
     </w:rPr>
   </w:style>
-  <w:style w:type="numbering" w:styleId="Bezlistyuser" w:default="1">
-    <w:name w:val="Bez listy (user)"/>
+  <w:style w:type="numbering" w:styleId="Bezlisty" w:default="1">
+    <w:name w:val="Bez listy"/>
     <w:uiPriority w:val="99"/>
     <w:semiHidden/>
     <w:unhideWhenUsed/>

</xml_diff>

<commit_message>
build: reinstall Monolog and restore Composer dependencies
</commit_message>
<xml_diff>
--- a/lab-a/AI2-LA-gr432-woźniak-jakub.docx
+++ b/lab-a/AI2-LA-gr432-woźniak-jakub.docx
@@ -6,20 +6,20 @@
       <w:tblPr>
         <w:tblStyle w:val="Tabela-Siatka"/>
         <w:tblW w:w="10456" w:type="dxa"/>
-        <w:jc w:val="start"/>
+        <w:jc w:val="left"/>
         <w:tblInd w:w="113" w:type="dxa"/>
         <w:tblLayout w:type="fixed"/>
         <w:tblCellMar>
           <w:top w:w="0" w:type="dxa"/>
-          <w:start w:w="108" w:type="dxa"/>
+          <w:left w:w="108" w:type="dxa"/>
           <w:bottom w:w="0" w:type="dxa"/>
-          <w:end w:w="108" w:type="dxa"/>
+          <w:right w:w="108" w:type="dxa"/>
         </w:tblCellMar>
         <w:tblLook w:val="04a0" w:firstRow="1" w:noVBand="1" w:lastRow="0" w:firstColumn="1" w:lastColumn="0" w:noHBand="0"/>
       </w:tblPr>
       <w:tblGrid>
-        <w:gridCol w:w="1693"/>
-        <w:gridCol w:w="4256"/>
+        <w:gridCol w:w="1692"/>
+        <w:gridCol w:w="4257"/>
         <w:gridCol w:w="4507"/>
       </w:tblGrid>
       <w:tr>
@@ -28,13 +28,13 @@
         </w:trPr>
         <w:tc>
           <w:tcPr>
-            <w:tcW w:w="1693" w:type="dxa"/>
+            <w:tcW w:w="1692" w:type="dxa"/>
             <w:vMerge w:val="restart"/>
             <w:tcBorders>
               <w:top w:val="single" w:sz="4" w:space="0" w:color="D9D9D9"/>
-              <w:start w:val="single" w:sz="4" w:space="0" w:color="D9D9D9"/>
+              <w:left w:val="single" w:sz="4" w:space="0" w:color="D9D9D9"/>
               <w:bottom w:val="single" w:sz="4" w:space="0" w:color="D9D9D9"/>
-              <w:end w:val="single" w:sz="4" w:space="0" w:color="D9D9D9"/>
+              <w:right w:val="single" w:sz="4" w:space="0" w:color="D9D9D9"/>
             </w:tcBorders>
             <w:shd w:color="auto" w:fill="D9D9D9" w:themeFill="background1" w:themeFillShade="d9" w:val="clear"/>
             <w:vAlign w:val="bottom"/>
@@ -116,13 +116,13 @@
         </w:tc>
         <w:tc>
           <w:tcPr>
-            <w:tcW w:w="4256" w:type="dxa"/>
+            <w:tcW w:w="4257" w:type="dxa"/>
             <w:vMerge w:val="restart"/>
             <w:tcBorders>
               <w:top w:val="single" w:sz="4" w:space="0" w:color="D9D9D9"/>
-              <w:start w:val="single" w:sz="4" w:space="0" w:color="D9D9D9"/>
+              <w:left w:val="single" w:sz="4" w:space="0" w:color="D9D9D9"/>
               <w:bottom w:val="single" w:sz="4" w:space="0" w:color="D9D9D9"/>
-              <w:end w:val="single" w:sz="4" w:space="0" w:color="D9D9D9"/>
+              <w:right w:val="single" w:sz="4" w:space="0" w:color="D9D9D9"/>
             </w:tcBorders>
             <w:vAlign w:val="center"/>
           </w:tcPr>
@@ -400,9 +400,9 @@
             <w:tcW w:w="4507" w:type="dxa"/>
             <w:tcBorders>
               <w:top w:val="single" w:sz="4" w:space="0" w:color="D9D9D9"/>
-              <w:start w:val="single" w:sz="4" w:space="0" w:color="D9D9D9"/>
+              <w:left w:val="single" w:sz="4" w:space="0" w:color="D9D9D9"/>
               <w:bottom w:val="single" w:sz="4" w:space="0" w:color="D9D9D9"/>
-              <w:end w:val="single" w:sz="4" w:space="0" w:color="D9D9D9"/>
+              <w:right w:val="single" w:sz="4" w:space="0" w:color="D9D9D9"/>
             </w:tcBorders>
             <w:vAlign w:val="center"/>
           </w:tcPr>
@@ -412,7 +412,7 @@
               <w:widowControl/>
               <w:suppressAutoHyphens w:val="true"/>
               <w:spacing w:lineRule="auto" w:line="240" w:before="0" w:after="0"/>
-              <w:jc w:val="end"/>
+              <w:jc w:val="right"/>
               <w:rPr>
                 <w:b/>
                 <w:bCs/>
@@ -500,13 +500,13 @@
         </w:trPr>
         <w:tc>
           <w:tcPr>
-            <w:tcW w:w="1693" w:type="dxa"/>
+            <w:tcW w:w="1692" w:type="dxa"/>
             <w:vMerge w:val="continue"/>
             <w:tcBorders>
               <w:top w:val="single" w:sz="4" w:space="0" w:color="D9D9D9"/>
-              <w:start w:val="single" w:sz="4" w:space="0" w:color="D9D9D9"/>
+              <w:left w:val="single" w:sz="4" w:space="0" w:color="D9D9D9"/>
               <w:bottom w:val="single" w:sz="4" w:space="0" w:color="D9D9D9"/>
-              <w:end w:val="single" w:sz="4" w:space="0" w:color="D9D9D9"/>
+              <w:right w:val="single" w:sz="4" w:space="0" w:color="D9D9D9"/>
             </w:tcBorders>
             <w:shd w:color="auto" w:fill="D9D9D9" w:themeFill="background1" w:themeFillShade="d9" w:val="clear"/>
             <w:vAlign w:val="bottom"/>
@@ -539,13 +539,13 @@
         </w:tc>
         <w:tc>
           <w:tcPr>
-            <w:tcW w:w="4256" w:type="dxa"/>
+            <w:tcW w:w="4257" w:type="dxa"/>
             <w:vMerge w:val="continue"/>
             <w:tcBorders>
               <w:top w:val="single" w:sz="4" w:space="0" w:color="D9D9D9"/>
-              <w:start w:val="single" w:sz="4" w:space="0" w:color="D9D9D9"/>
+              <w:left w:val="single" w:sz="4" w:space="0" w:color="D9D9D9"/>
               <w:bottom w:val="single" w:sz="4" w:space="0" w:color="D9D9D9"/>
-              <w:end w:val="single" w:sz="4" w:space="0" w:color="D9D9D9"/>
+              <w:right w:val="single" w:sz="4" w:space="0" w:color="D9D9D9"/>
             </w:tcBorders>
             <w:vAlign w:val="center"/>
           </w:tcPr>
@@ -577,9 +577,9 @@
             <w:vMerge w:val="restart"/>
             <w:tcBorders>
               <w:top w:val="single" w:sz="4" w:space="0" w:color="D9D9D9"/>
-              <w:start w:val="single" w:sz="4" w:space="0" w:color="D9D9D9"/>
+              <w:left w:val="single" w:sz="4" w:space="0" w:color="D9D9D9"/>
               <w:bottom w:val="single" w:sz="4" w:space="0" w:color="D9D9D9"/>
-              <w:end w:val="single" w:sz="4" w:space="0" w:color="D9D9D9"/>
+              <w:right w:val="single" w:sz="4" w:space="0" w:color="D9D9D9"/>
             </w:tcBorders>
           </w:tcPr>
           <w:p>
@@ -588,13 +588,14 @@
               <w:widowControl/>
               <w:suppressAutoHyphens w:val="true"/>
               <w:spacing w:lineRule="auto" w:line="240" w:before="0" w:after="0"/>
-              <w:jc w:val="start"/>
+              <w:jc w:val="left"/>
               <w:rPr>
                 <w:lang w:val="pl-PL"/>
               </w:rPr>
             </w:pPr>
             <w:r>
               <w:rPr>
+                <w:sz w:val="22"/>
                 <w:lang w:val="pl-PL"/>
               </w:rPr>
             </w:r>
@@ -607,12 +608,12 @@
         </w:trPr>
         <w:tc>
           <w:tcPr>
-            <w:tcW w:w="1693" w:type="dxa"/>
+            <w:tcW w:w="1692" w:type="dxa"/>
             <w:tcBorders>
               <w:top w:val="single" w:sz="4" w:space="0" w:color="D9D9D9"/>
-              <w:start w:val="single" w:sz="4" w:space="0" w:color="D9D9D9"/>
+              <w:left w:val="single" w:sz="4" w:space="0" w:color="D9D9D9"/>
               <w:bottom w:val="single" w:sz="4" w:space="0" w:color="D9D9D9"/>
-              <w:end w:val="single" w:sz="4" w:space="0" w:color="D9D9D9"/>
+              <w:right w:val="single" w:sz="4" w:space="0" w:color="D9D9D9"/>
             </w:tcBorders>
             <w:shd w:color="auto" w:fill="D9D9D9" w:themeFill="background1" w:themeFillShade="d9" w:val="clear"/>
           </w:tcPr>
@@ -693,13 +694,13 @@
         </w:tc>
         <w:tc>
           <w:tcPr>
-            <w:tcW w:w="4256" w:type="dxa"/>
+            <w:tcW w:w="4257" w:type="dxa"/>
             <w:vMerge w:val="continue"/>
             <w:tcBorders>
               <w:top w:val="single" w:sz="4" w:space="0" w:color="D9D9D9"/>
-              <w:start w:val="single" w:sz="4" w:space="0" w:color="D9D9D9"/>
+              <w:left w:val="single" w:sz="4" w:space="0" w:color="D9D9D9"/>
               <w:bottom w:val="single" w:sz="4" w:space="0" w:color="D9D9D9"/>
-              <w:end w:val="single" w:sz="4" w:space="0" w:color="D9D9D9"/>
+              <w:right w:val="single" w:sz="4" w:space="0" w:color="D9D9D9"/>
             </w:tcBorders>
           </w:tcPr>
           <w:p>
@@ -708,13 +709,14 @@
               <w:widowControl/>
               <w:suppressAutoHyphens w:val="true"/>
               <w:spacing w:lineRule="auto" w:line="240" w:before="0" w:after="0"/>
-              <w:jc w:val="start"/>
+              <w:jc w:val="left"/>
               <w:rPr>
                 <w:lang w:val="pl-PL"/>
               </w:rPr>
             </w:pPr>
             <w:r>
               <w:rPr>
+                <w:sz w:val="22"/>
                 <w:lang w:val="pl-PL"/>
               </w:rPr>
             </w:r>
@@ -726,9 +728,9 @@
             <w:vMerge w:val="continue"/>
             <w:tcBorders>
               <w:top w:val="single" w:sz="4" w:space="0" w:color="D9D9D9"/>
-              <w:start w:val="single" w:sz="4" w:space="0" w:color="D9D9D9"/>
+              <w:left w:val="single" w:sz="4" w:space="0" w:color="D9D9D9"/>
               <w:bottom w:val="single" w:sz="4" w:space="0" w:color="D9D9D9"/>
-              <w:end w:val="single" w:sz="4" w:space="0" w:color="D9D9D9"/>
+              <w:right w:val="single" w:sz="4" w:space="0" w:color="D9D9D9"/>
             </w:tcBorders>
           </w:tcPr>
           <w:p>
@@ -737,13 +739,14 @@
               <w:widowControl/>
               <w:suppressAutoHyphens w:val="true"/>
               <w:spacing w:lineRule="auto" w:line="240" w:before="0" w:after="0"/>
-              <w:jc w:val="start"/>
+              <w:jc w:val="left"/>
               <w:rPr>
                 <w:lang w:val="pl-PL"/>
               </w:rPr>
             </w:pPr>
             <w:r>
               <w:rPr>
+                <w:sz w:val="22"/>
                 <w:lang w:val="pl-PL"/>
               </w:rPr>
             </w:r>
@@ -2661,20 +2664,20 @@
       <w:tblPr>
         <w:tblStyle w:val="Tabela-Siatka"/>
         <w:tblW w:w="5000" w:type="pct"/>
-        <w:jc w:val="start"/>
+        <w:jc w:val="left"/>
         <w:tblInd w:w="113" w:type="dxa"/>
         <w:tblLayout w:type="fixed"/>
         <w:tblCellMar>
           <w:top w:w="0" w:type="dxa"/>
-          <w:start w:w="108" w:type="dxa"/>
+          <w:left w:w="108" w:type="dxa"/>
           <w:bottom w:w="0" w:type="dxa"/>
-          <w:end w:w="108" w:type="dxa"/>
+          <w:right w:w="108" w:type="dxa"/>
         </w:tblCellMar>
         <w:tblLook w:val="04a0" w:firstRow="1" w:noVBand="1" w:lastRow="0" w:firstColumn="1" w:lastColumn="0" w:noHBand="0"/>
       </w:tblPr>
       <w:tblGrid>
-        <w:gridCol w:w="8193"/>
-        <w:gridCol w:w="1137"/>
+        <w:gridCol w:w="8192"/>
+        <w:gridCol w:w="1138"/>
         <w:gridCol w:w="1136"/>
       </w:tblGrid>
       <w:tr>
@@ -2683,7 +2686,7 @@
         </w:trPr>
         <w:tc>
           <w:tcPr>
-            <w:tcW w:w="8193" w:type="dxa"/>
+            <w:tcW w:w="8192" w:type="dxa"/>
             <w:tcBorders/>
             <w:vAlign w:val="center"/>
           </w:tcPr>
@@ -2693,7 +2696,7 @@
               <w:widowControl/>
               <w:suppressAutoHyphens w:val="true"/>
               <w:spacing w:before="0" w:after="0"/>
-              <w:jc w:val="start"/>
+              <w:jc w:val="left"/>
               <w:rPr>
                 <w:rFonts w:ascii="Calibri" w:hAnsi="Calibri" w:eastAsia="Calibri" w:cs="Arial"/>
                 <w:kern w:val="2"/>
@@ -2716,7 +2719,7 @@
         </w:tc>
         <w:tc>
           <w:tcPr>
-            <w:tcW w:w="1137" w:type="dxa"/>
+            <w:tcW w:w="1138" w:type="dxa"/>
             <w:tcBorders/>
             <w:vAlign w:val="center"/>
           </w:tcPr>
@@ -3465,20 +3468,20 @@
       <w:tblPr>
         <w:tblStyle w:val="Tabela-Siatka"/>
         <w:tblW w:w="5000" w:type="pct"/>
-        <w:jc w:val="start"/>
+        <w:jc w:val="left"/>
         <w:tblInd w:w="113" w:type="dxa"/>
         <w:tblLayout w:type="fixed"/>
         <w:tblCellMar>
           <w:top w:w="0" w:type="dxa"/>
-          <w:start w:w="108" w:type="dxa"/>
+          <w:left w:w="108" w:type="dxa"/>
           <w:bottom w:w="0" w:type="dxa"/>
-          <w:end w:w="108" w:type="dxa"/>
+          <w:right w:w="108" w:type="dxa"/>
         </w:tblCellMar>
         <w:tblLook w:val="04a0" w:firstRow="1" w:noVBand="1" w:lastRow="0" w:firstColumn="1" w:lastColumn="0" w:noHBand="0"/>
       </w:tblPr>
       <w:tblGrid>
-        <w:gridCol w:w="8193"/>
-        <w:gridCol w:w="1137"/>
+        <w:gridCol w:w="8192"/>
+        <w:gridCol w:w="1138"/>
         <w:gridCol w:w="1136"/>
       </w:tblGrid>
       <w:tr>
@@ -3487,7 +3490,7 @@
         </w:trPr>
         <w:tc>
           <w:tcPr>
-            <w:tcW w:w="8193" w:type="dxa"/>
+            <w:tcW w:w="8192" w:type="dxa"/>
             <w:tcBorders/>
             <w:vAlign w:val="center"/>
           </w:tcPr>
@@ -3497,7 +3500,7 @@
               <w:widowControl/>
               <w:suppressAutoHyphens w:val="true"/>
               <w:spacing w:before="0" w:after="0"/>
-              <w:jc w:val="start"/>
+              <w:jc w:val="left"/>
               <w:rPr>
                 <w:rFonts w:ascii="Calibri" w:hAnsi="Calibri" w:eastAsia="Calibri" w:cs="Arial"/>
                 <w:kern w:val="2"/>
@@ -3520,7 +3523,7 @@
         </w:tc>
         <w:tc>
           <w:tcPr>
-            <w:tcW w:w="1137" w:type="dxa"/>
+            <w:tcW w:w="1138" w:type="dxa"/>
             <w:tcBorders/>
             <w:vAlign w:val="center"/>
           </w:tcPr>
@@ -4312,20 +4315,20 @@
       <w:tblPr>
         <w:tblStyle w:val="Tabela-Siatka"/>
         <w:tblW w:w="5000" w:type="pct"/>
-        <w:jc w:val="start"/>
+        <w:jc w:val="left"/>
         <w:tblInd w:w="113" w:type="dxa"/>
         <w:tblLayout w:type="fixed"/>
         <w:tblCellMar>
           <w:top w:w="0" w:type="dxa"/>
-          <w:start w:w="108" w:type="dxa"/>
+          <w:left w:w="108" w:type="dxa"/>
           <w:bottom w:w="0" w:type="dxa"/>
-          <w:end w:w="108" w:type="dxa"/>
+          <w:right w:w="108" w:type="dxa"/>
         </w:tblCellMar>
         <w:tblLook w:val="04a0" w:firstRow="1" w:noVBand="1" w:lastRow="0" w:firstColumn="1" w:lastColumn="0" w:noHBand="0"/>
       </w:tblPr>
       <w:tblGrid>
-        <w:gridCol w:w="8193"/>
-        <w:gridCol w:w="1137"/>
+        <w:gridCol w:w="8192"/>
+        <w:gridCol w:w="1138"/>
         <w:gridCol w:w="1136"/>
       </w:tblGrid>
       <w:tr>
@@ -4334,7 +4337,7 @@
         </w:trPr>
         <w:tc>
           <w:tcPr>
-            <w:tcW w:w="8193" w:type="dxa"/>
+            <w:tcW w:w="8192" w:type="dxa"/>
             <w:tcBorders/>
             <w:vAlign w:val="center"/>
           </w:tcPr>
@@ -4344,7 +4347,7 @@
               <w:widowControl/>
               <w:suppressAutoHyphens w:val="true"/>
               <w:spacing w:before="0" w:after="0"/>
-              <w:jc w:val="start"/>
+              <w:jc w:val="left"/>
               <w:rPr>
                 <w:rFonts w:ascii="Calibri" w:hAnsi="Calibri" w:eastAsia="Calibri" w:cs="Arial"/>
                 <w:kern w:val="2"/>
@@ -4367,7 +4370,7 @@
         </w:tc>
         <w:tc>
           <w:tcPr>
-            <w:tcW w:w="1137" w:type="dxa"/>
+            <w:tcW w:w="1138" w:type="dxa"/>
             <w:tcBorders/>
             <w:vAlign w:val="center"/>
           </w:tcPr>
@@ -4933,11 +4936,7 @@
       </w:pPr>
       <w:r>
         <w:rPr/>
-        <w:t>…</w:t>
-      </w:r>
-      <w:r>
-        <w:rPr/>
-        <w:t>omówienie…</w:t>
+        <w:t>tablica została ale jest pusta</w:t>
       </w:r>
     </w:p>
     <w:p>
@@ -4995,11 +4994,7 @@
       </w:pPr>
       <w:r>
         <w:rPr/>
-        <w:t>…</w:t>
-      </w:r>
-      <w:r>
-        <w:rPr/>
-        <w:t>omówienie…</w:t>
+        <w:t>Usunęliśmy pliki wymagane do działania programu i php zwraca błąd informujący o tym, że nie może otworzyć plików.</w:t>
       </w:r>
     </w:p>
     <w:p>
@@ -5021,7 +5016,7 @@
         <w:rPr/>
         <w:drawing>
           <wp:inline distT="0" distB="0" distL="0" distR="0">
-            <wp:extent cx="899795" cy="899795"/>
+            <wp:extent cx="6645910" cy="2725420"/>
             <wp:effectExtent l="0" t="0" r="0" b="0"/>
             <wp:docPr id="12" name="Obraz 193031578"/>
             <wp:cNvGraphicFramePr>
@@ -5045,7 +5040,7 @@
                   <pic:spPr bwMode="auto">
                     <a:xfrm>
                       <a:off x="0" y="0"/>
-                      <a:ext cx="899795" cy="899795"/>
+                      <a:ext cx="6645910" cy="2725420"/>
                     </a:xfrm>
                     <a:prstGeom prst="rect">
                       <a:avLst/>
@@ -5063,20 +5058,20 @@
       <w:tblPr>
         <w:tblStyle w:val="Tabela-Siatka"/>
         <w:tblW w:w="5000" w:type="pct"/>
-        <w:jc w:val="start"/>
+        <w:jc w:val="left"/>
         <w:tblInd w:w="113" w:type="dxa"/>
         <w:tblLayout w:type="fixed"/>
         <w:tblCellMar>
           <w:top w:w="0" w:type="dxa"/>
-          <w:start w:w="108" w:type="dxa"/>
+          <w:left w:w="108" w:type="dxa"/>
           <w:bottom w:w="0" w:type="dxa"/>
-          <w:end w:w="108" w:type="dxa"/>
+          <w:right w:w="108" w:type="dxa"/>
         </w:tblCellMar>
         <w:tblLook w:val="04a0" w:firstRow="1" w:noVBand="1" w:lastRow="0" w:firstColumn="1" w:lastColumn="0" w:noHBand="0"/>
       </w:tblPr>
       <w:tblGrid>
-        <w:gridCol w:w="8193"/>
-        <w:gridCol w:w="1137"/>
+        <w:gridCol w:w="8192"/>
+        <w:gridCol w:w="1138"/>
         <w:gridCol w:w="1136"/>
       </w:tblGrid>
       <w:tr>
@@ -5085,7 +5080,7 @@
         </w:trPr>
         <w:tc>
           <w:tcPr>
-            <w:tcW w:w="8193" w:type="dxa"/>
+            <w:tcW w:w="8192" w:type="dxa"/>
             <w:tcBorders/>
             <w:vAlign w:val="center"/>
           </w:tcPr>
@@ -5095,7 +5090,7 @@
               <w:widowControl/>
               <w:suppressAutoHyphens w:val="true"/>
               <w:spacing w:before="0" w:after="0"/>
-              <w:jc w:val="start"/>
+              <w:jc w:val="left"/>
               <w:rPr>
                 <w:rFonts w:ascii="Calibri" w:hAnsi="Calibri" w:eastAsia="Calibri" w:cs="Arial"/>
                 <w:kern w:val="2"/>
@@ -5118,7 +5113,7 @@
         </w:tc>
         <w:tc>
           <w:tcPr>
-            <w:tcW w:w="1137" w:type="dxa"/>
+            <w:tcW w:w="1138" w:type="dxa"/>
             <w:tcBorders/>
             <w:vAlign w:val="center"/>
           </w:tcPr>
@@ -5683,20 +5678,20 @@
       <w:tblPr>
         <w:tblStyle w:val="Tabela-Siatka"/>
         <w:tblW w:w="5000" w:type="pct"/>
-        <w:jc w:val="start"/>
+        <w:jc w:val="left"/>
         <w:tblInd w:w="113" w:type="dxa"/>
         <w:tblLayout w:type="fixed"/>
         <w:tblCellMar>
           <w:top w:w="0" w:type="dxa"/>
-          <w:start w:w="108" w:type="dxa"/>
+          <w:left w:w="108" w:type="dxa"/>
           <w:bottom w:w="0" w:type="dxa"/>
-          <w:end w:w="108" w:type="dxa"/>
+          <w:right w:w="108" w:type="dxa"/>
         </w:tblCellMar>
         <w:tblLook w:val="04a0" w:firstRow="1" w:noVBand="1" w:lastRow="0" w:firstColumn="1" w:lastColumn="0" w:noHBand="0"/>
       </w:tblPr>
       <w:tblGrid>
-        <w:gridCol w:w="8193"/>
-        <w:gridCol w:w="1137"/>
+        <w:gridCol w:w="8192"/>
+        <w:gridCol w:w="1138"/>
         <w:gridCol w:w="1136"/>
       </w:tblGrid>
       <w:tr>
@@ -5705,7 +5700,7 @@
         </w:trPr>
         <w:tc>
           <w:tcPr>
-            <w:tcW w:w="8193" w:type="dxa"/>
+            <w:tcW w:w="8192" w:type="dxa"/>
             <w:tcBorders/>
             <w:vAlign w:val="center"/>
           </w:tcPr>
@@ -5715,7 +5710,7 @@
               <w:widowControl/>
               <w:suppressAutoHyphens w:val="true"/>
               <w:spacing w:before="0" w:after="0"/>
-              <w:jc w:val="start"/>
+              <w:jc w:val="left"/>
               <w:rPr>
                 <w:rFonts w:ascii="Calibri" w:hAnsi="Calibri" w:eastAsia="Calibri" w:cs="Arial"/>
                 <w:kern w:val="2"/>
@@ -5738,7 +5733,7 @@
         </w:tc>
         <w:tc>
           <w:tcPr>
-            <w:tcW w:w="1137" w:type="dxa"/>
+            <w:tcW w:w="1138" w:type="dxa"/>
             <w:tcBorders/>
             <w:vAlign w:val="center"/>
           </w:tcPr>
@@ -6927,20 +6922,20 @@
       <w:tblPr>
         <w:tblStyle w:val="Tabela-Siatka"/>
         <w:tblW w:w="5000" w:type="pct"/>
-        <w:jc w:val="start"/>
+        <w:jc w:val="left"/>
         <w:tblInd w:w="113" w:type="dxa"/>
         <w:tblLayout w:type="fixed"/>
         <w:tblCellMar>
           <w:top w:w="0" w:type="dxa"/>
-          <w:start w:w="108" w:type="dxa"/>
+          <w:left w:w="108" w:type="dxa"/>
           <w:bottom w:w="0" w:type="dxa"/>
-          <w:end w:w="108" w:type="dxa"/>
+          <w:right w:w="108" w:type="dxa"/>
         </w:tblCellMar>
         <w:tblLook w:val="04a0" w:firstRow="1" w:noVBand="1" w:lastRow="0" w:firstColumn="1" w:lastColumn="0" w:noHBand="0"/>
       </w:tblPr>
       <w:tblGrid>
-        <w:gridCol w:w="8193"/>
-        <w:gridCol w:w="1137"/>
+        <w:gridCol w:w="8192"/>
+        <w:gridCol w:w="1138"/>
         <w:gridCol w:w="1136"/>
       </w:tblGrid>
       <w:tr>
@@ -6949,7 +6944,7 @@
         </w:trPr>
         <w:tc>
           <w:tcPr>
-            <w:tcW w:w="8193" w:type="dxa"/>
+            <w:tcW w:w="8192" w:type="dxa"/>
             <w:tcBorders/>
             <w:vAlign w:val="center"/>
           </w:tcPr>
@@ -6959,7 +6954,7 @@
               <w:widowControl/>
               <w:suppressAutoHyphens w:val="true"/>
               <w:spacing w:before="0" w:after="0"/>
-              <w:jc w:val="start"/>
+              <w:jc w:val="left"/>
               <w:rPr>
                 <w:rFonts w:ascii="Calibri" w:hAnsi="Calibri" w:eastAsia="Calibri" w:cs="Arial"/>
                 <w:kern w:val="2"/>
@@ -6982,7 +6977,7 @@
         </w:tc>
         <w:tc>
           <w:tcPr>
-            <w:tcW w:w="1137" w:type="dxa"/>
+            <w:tcW w:w="1138" w:type="dxa"/>
             <w:tcBorders/>
             <w:vAlign w:val="center"/>
           </w:tcPr>
@@ -7171,7 +7166,7 @@
       <w:p>
         <w:pPr>
           <w:pStyle w:val="Footer"/>
-          <w:jc w:val="end"/>
+          <w:jc w:val="right"/>
           <w:rPr/>
         </w:pPr>
         <w:r>
@@ -7214,7 +7209,7 @@
             <w:sz w:val="24"/>
             <w:szCs w:val="24"/>
           </w:rPr>
-          <w:t>11</w:t>
+          <w:t>12</w:t>
         </w:r>
         <w:r>
           <w:rPr>
@@ -7265,7 +7260,7 @@
             <w:sz w:val="24"/>
             <w:szCs w:val="24"/>
           </w:rPr>
-          <w:t>11</w:t>
+          <w:t>12</w:t>
         </w:r>
         <w:r>
           <w:rPr>
@@ -7307,7 +7302,7 @@
       <w:p>
         <w:pPr>
           <w:pStyle w:val="Footer"/>
-          <w:jc w:val="end"/>
+          <w:jc w:val="right"/>
           <w:rPr/>
         </w:pPr>
         <w:r>
@@ -7401,7 +7396,7 @@
             <w:sz w:val="24"/>
             <w:szCs w:val="24"/>
           </w:rPr>
-          <w:t>11</w:t>
+          <w:t>12</w:t>
         </w:r>
         <w:r>
           <w:rPr>
@@ -7655,12 +7650,12 @@
       <w:start w:val="1"/>
       <w:numFmt w:val="bullet"/>
       <w:lvlText w:val=""/>
-      <w:lvlJc w:val="start"/>
+      <w:lvlJc w:val="left"/>
       <w:pPr>
         <w:tabs>
           <w:tab w:val="num" w:pos="0"/>
         </w:tabs>
-        <w:ind w:start="720" w:hanging="360"/>
+        <w:ind w:left="720" w:hanging="360"/>
       </w:pPr>
       <w:rPr>
         <w:rFonts w:ascii="Symbol" w:hAnsi="Symbol" w:cs="Symbol" w:hint="default"/>
@@ -7670,12 +7665,12 @@
       <w:start w:val="1"/>
       <w:numFmt w:val="bullet"/>
       <w:lvlText w:val="o"/>
-      <w:lvlJc w:val="start"/>
+      <w:lvlJc w:val="left"/>
       <w:pPr>
         <w:tabs>
           <w:tab w:val="num" w:pos="0"/>
         </w:tabs>
-        <w:ind w:start="1440" w:hanging="360"/>
+        <w:ind w:left="1440" w:hanging="360"/>
       </w:pPr>
       <w:rPr>
         <w:rFonts w:ascii="Courier New" w:hAnsi="Courier New" w:cs="Courier New" w:hint="default"/>
@@ -7685,12 +7680,12 @@
       <w:start w:val="1"/>
       <w:numFmt w:val="bullet"/>
       <w:lvlText w:val=""/>
-      <w:lvlJc w:val="start"/>
+      <w:lvlJc w:val="left"/>
       <w:pPr>
         <w:tabs>
           <w:tab w:val="num" w:pos="0"/>
         </w:tabs>
-        <w:ind w:start="2160" w:hanging="360"/>
+        <w:ind w:left="2160" w:hanging="360"/>
       </w:pPr>
       <w:rPr>
         <w:rFonts w:ascii="Wingdings" w:hAnsi="Wingdings" w:cs="Wingdings" w:hint="default"/>
@@ -7700,12 +7695,12 @@
       <w:start w:val="1"/>
       <w:numFmt w:val="bullet"/>
       <w:lvlText w:val=""/>
-      <w:lvlJc w:val="start"/>
+      <w:lvlJc w:val="left"/>
       <w:pPr>
         <w:tabs>
           <w:tab w:val="num" w:pos="0"/>
         </w:tabs>
-        <w:ind w:start="2880" w:hanging="360"/>
+        <w:ind w:left="2880" w:hanging="360"/>
       </w:pPr>
       <w:rPr>
         <w:rFonts w:ascii="Symbol" w:hAnsi="Symbol" w:cs="Symbol" w:hint="default"/>
@@ -7715,12 +7710,12 @@
       <w:start w:val="1"/>
       <w:numFmt w:val="bullet"/>
       <w:lvlText w:val="o"/>
-      <w:lvlJc w:val="start"/>
+      <w:lvlJc w:val="left"/>
       <w:pPr>
         <w:tabs>
           <w:tab w:val="num" w:pos="0"/>
         </w:tabs>
-        <w:ind w:start="3600" w:hanging="360"/>
+        <w:ind w:left="3600" w:hanging="360"/>
       </w:pPr>
       <w:rPr>
         <w:rFonts w:ascii="Courier New" w:hAnsi="Courier New" w:cs="Courier New" w:hint="default"/>
@@ -7730,12 +7725,12 @@
       <w:start w:val="1"/>
       <w:numFmt w:val="bullet"/>
       <w:lvlText w:val=""/>
-      <w:lvlJc w:val="start"/>
+      <w:lvlJc w:val="left"/>
       <w:pPr>
         <w:tabs>
           <w:tab w:val="num" w:pos="0"/>
         </w:tabs>
-        <w:ind w:start="4320" w:hanging="360"/>
+        <w:ind w:left="4320" w:hanging="360"/>
       </w:pPr>
       <w:rPr>
         <w:rFonts w:ascii="Wingdings" w:hAnsi="Wingdings" w:cs="Wingdings" w:hint="default"/>
@@ -7745,12 +7740,12 @@
       <w:start w:val="1"/>
       <w:numFmt w:val="bullet"/>
       <w:lvlText w:val=""/>
-      <w:lvlJc w:val="start"/>
+      <w:lvlJc w:val="left"/>
       <w:pPr>
         <w:tabs>
           <w:tab w:val="num" w:pos="0"/>
         </w:tabs>
-        <w:ind w:start="5040" w:hanging="360"/>
+        <w:ind w:left="5040" w:hanging="360"/>
       </w:pPr>
       <w:rPr>
         <w:rFonts w:ascii="Symbol" w:hAnsi="Symbol" w:cs="Symbol" w:hint="default"/>
@@ -7760,12 +7755,12 @@
       <w:start w:val="1"/>
       <w:numFmt w:val="bullet"/>
       <w:lvlText w:val="o"/>
-      <w:lvlJc w:val="start"/>
+      <w:lvlJc w:val="left"/>
       <w:pPr>
         <w:tabs>
           <w:tab w:val="num" w:pos="0"/>
         </w:tabs>
-        <w:ind w:start="5760" w:hanging="360"/>
+        <w:ind w:left="5760" w:hanging="360"/>
       </w:pPr>
       <w:rPr>
         <w:rFonts w:ascii="Courier New" w:hAnsi="Courier New" w:cs="Courier New" w:hint="default"/>
@@ -7775,12 +7770,12 @@
       <w:start w:val="1"/>
       <w:numFmt w:val="bullet"/>
       <w:lvlText w:val=""/>
-      <w:lvlJc w:val="start"/>
+      <w:lvlJc w:val="left"/>
       <w:pPr>
         <w:tabs>
           <w:tab w:val="num" w:pos="0"/>
         </w:tabs>
-        <w:ind w:start="6480" w:hanging="360"/>
+        <w:ind w:left="6480" w:hanging="360"/>
       </w:pPr>
       <w:rPr>
         <w:rFonts w:ascii="Wingdings" w:hAnsi="Wingdings" w:cs="Wingdings" w:hint="default"/>
@@ -7792,12 +7787,12 @@
       <w:start w:val="1"/>
       <w:numFmt w:val="bullet"/>
       <w:lvlText w:val=""/>
-      <w:lvlJc w:val="start"/>
+      <w:lvlJc w:val="left"/>
       <w:pPr>
         <w:tabs>
           <w:tab w:val="num" w:pos="0"/>
         </w:tabs>
-        <w:ind w:start="720" w:hanging="360"/>
+        <w:ind w:left="720" w:hanging="360"/>
       </w:pPr>
       <w:rPr>
         <w:rFonts w:ascii="Symbol" w:hAnsi="Symbol" w:cs="Symbol" w:hint="default"/>
@@ -7807,12 +7802,12 @@
       <w:start w:val="1"/>
       <w:numFmt w:val="bullet"/>
       <w:lvlText w:val="o"/>
-      <w:lvlJc w:val="start"/>
+      <w:lvlJc w:val="left"/>
       <w:pPr>
         <w:tabs>
           <w:tab w:val="num" w:pos="0"/>
         </w:tabs>
-        <w:ind w:start="1440" w:hanging="360"/>
+        <w:ind w:left="1440" w:hanging="360"/>
       </w:pPr>
       <w:rPr>
         <w:rFonts w:ascii="Courier New" w:hAnsi="Courier New" w:cs="Courier New" w:hint="default"/>
@@ -7822,12 +7817,12 @@
       <w:start w:val="1"/>
       <w:numFmt w:val="bullet"/>
       <w:lvlText w:val=""/>
-      <w:lvlJc w:val="start"/>
+      <w:lvlJc w:val="left"/>
       <w:pPr>
         <w:tabs>
           <w:tab w:val="num" w:pos="0"/>
         </w:tabs>
-        <w:ind w:start="2160" w:hanging="360"/>
+        <w:ind w:left="2160" w:hanging="360"/>
       </w:pPr>
       <w:rPr>
         <w:rFonts w:ascii="Wingdings" w:hAnsi="Wingdings" w:cs="Wingdings" w:hint="default"/>
@@ -7837,12 +7832,12 @@
       <w:start w:val="1"/>
       <w:numFmt w:val="bullet"/>
       <w:lvlText w:val=""/>
-      <w:lvlJc w:val="start"/>
+      <w:lvlJc w:val="left"/>
       <w:pPr>
         <w:tabs>
           <w:tab w:val="num" w:pos="0"/>
         </w:tabs>
-        <w:ind w:start="2880" w:hanging="360"/>
+        <w:ind w:left="2880" w:hanging="360"/>
       </w:pPr>
       <w:rPr>
         <w:rFonts w:ascii="Symbol" w:hAnsi="Symbol" w:cs="Symbol" w:hint="default"/>
@@ -7852,12 +7847,12 @@
       <w:start w:val="1"/>
       <w:numFmt w:val="bullet"/>
       <w:lvlText w:val="o"/>
-      <w:lvlJc w:val="start"/>
+      <w:lvlJc w:val="left"/>
       <w:pPr>
         <w:tabs>
           <w:tab w:val="num" w:pos="0"/>
         </w:tabs>
-        <w:ind w:start="3600" w:hanging="360"/>
+        <w:ind w:left="3600" w:hanging="360"/>
       </w:pPr>
       <w:rPr>
         <w:rFonts w:ascii="Courier New" w:hAnsi="Courier New" w:cs="Courier New" w:hint="default"/>
@@ -7867,12 +7862,12 @@
       <w:start w:val="1"/>
       <w:numFmt w:val="bullet"/>
       <w:lvlText w:val=""/>
-      <w:lvlJc w:val="start"/>
+      <w:lvlJc w:val="left"/>
       <w:pPr>
         <w:tabs>
           <w:tab w:val="num" w:pos="0"/>
         </w:tabs>
-        <w:ind w:start="4320" w:hanging="360"/>
+        <w:ind w:left="4320" w:hanging="360"/>
       </w:pPr>
       <w:rPr>
         <w:rFonts w:ascii="Wingdings" w:hAnsi="Wingdings" w:cs="Wingdings" w:hint="default"/>
@@ -7882,12 +7877,12 @@
       <w:start w:val="1"/>
       <w:numFmt w:val="bullet"/>
       <w:lvlText w:val=""/>
-      <w:lvlJc w:val="start"/>
+      <w:lvlJc w:val="left"/>
       <w:pPr>
         <w:tabs>
           <w:tab w:val="num" w:pos="0"/>
         </w:tabs>
-        <w:ind w:start="5040" w:hanging="360"/>
+        <w:ind w:left="5040" w:hanging="360"/>
       </w:pPr>
       <w:rPr>
         <w:rFonts w:ascii="Symbol" w:hAnsi="Symbol" w:cs="Symbol" w:hint="default"/>
@@ -7897,12 +7892,12 @@
       <w:start w:val="1"/>
       <w:numFmt w:val="bullet"/>
       <w:lvlText w:val="o"/>
-      <w:lvlJc w:val="start"/>
+      <w:lvlJc w:val="left"/>
       <w:pPr>
         <w:tabs>
           <w:tab w:val="num" w:pos="0"/>
         </w:tabs>
-        <w:ind w:start="5760" w:hanging="360"/>
+        <w:ind w:left="5760" w:hanging="360"/>
       </w:pPr>
       <w:rPr>
         <w:rFonts w:ascii="Courier New" w:hAnsi="Courier New" w:cs="Courier New" w:hint="default"/>
@@ -7912,12 +7907,12 @@
       <w:start w:val="1"/>
       <w:numFmt w:val="bullet"/>
       <w:lvlText w:val=""/>
-      <w:lvlJc w:val="start"/>
+      <w:lvlJc w:val="left"/>
       <w:pPr>
         <w:tabs>
           <w:tab w:val="num" w:pos="0"/>
         </w:tabs>
-        <w:ind w:start="6480" w:hanging="360"/>
+        <w:ind w:left="6480" w:hanging="360"/>
       </w:pPr>
       <w:rPr>
         <w:rFonts w:ascii="Wingdings" w:hAnsi="Wingdings" w:cs="Wingdings" w:hint="default"/>
@@ -7929,12 +7924,12 @@
       <w:start w:val="1"/>
       <w:numFmt w:val="bullet"/>
       <w:lvlText w:val=""/>
-      <w:lvlJc w:val="start"/>
+      <w:lvlJc w:val="left"/>
       <w:pPr>
         <w:tabs>
           <w:tab w:val="num" w:pos="0"/>
         </w:tabs>
-        <w:ind w:start="720" w:hanging="360"/>
+        <w:ind w:left="720" w:hanging="360"/>
       </w:pPr>
       <w:rPr>
         <w:rFonts w:ascii="Symbol" w:hAnsi="Symbol" w:cs="Symbol" w:hint="default"/>
@@ -7944,12 +7939,12 @@
       <w:start w:val="1"/>
       <w:numFmt w:val="bullet"/>
       <w:lvlText w:val="o"/>
-      <w:lvlJc w:val="start"/>
+      <w:lvlJc w:val="left"/>
       <w:pPr>
         <w:tabs>
           <w:tab w:val="num" w:pos="0"/>
         </w:tabs>
-        <w:ind w:start="1440" w:hanging="360"/>
+        <w:ind w:left="1440" w:hanging="360"/>
       </w:pPr>
       <w:rPr>
         <w:rFonts w:ascii="Courier New" w:hAnsi="Courier New" w:cs="Courier New" w:hint="default"/>
@@ -7959,12 +7954,12 @@
       <w:start w:val="1"/>
       <w:numFmt w:val="bullet"/>
       <w:lvlText w:val=""/>
-      <w:lvlJc w:val="start"/>
+      <w:lvlJc w:val="left"/>
       <w:pPr>
         <w:tabs>
           <w:tab w:val="num" w:pos="0"/>
         </w:tabs>
-        <w:ind w:start="2160" w:hanging="360"/>
+        <w:ind w:left="2160" w:hanging="360"/>
       </w:pPr>
       <w:rPr>
         <w:rFonts w:ascii="Wingdings" w:hAnsi="Wingdings" w:cs="Wingdings" w:hint="default"/>
@@ -7974,12 +7969,12 @@
       <w:start w:val="1"/>
       <w:numFmt w:val="bullet"/>
       <w:lvlText w:val=""/>
-      <w:lvlJc w:val="start"/>
+      <w:lvlJc w:val="left"/>
       <w:pPr>
         <w:tabs>
           <w:tab w:val="num" w:pos="0"/>
         </w:tabs>
-        <w:ind w:start="2880" w:hanging="360"/>
+        <w:ind w:left="2880" w:hanging="360"/>
       </w:pPr>
       <w:rPr>
         <w:rFonts w:ascii="Symbol" w:hAnsi="Symbol" w:cs="Symbol" w:hint="default"/>
@@ -7989,12 +7984,12 @@
       <w:start w:val="1"/>
       <w:numFmt w:val="bullet"/>
       <w:lvlText w:val="o"/>
-      <w:lvlJc w:val="start"/>
+      <w:lvlJc w:val="left"/>
       <w:pPr>
         <w:tabs>
           <w:tab w:val="num" w:pos="0"/>
         </w:tabs>
-        <w:ind w:start="3600" w:hanging="360"/>
+        <w:ind w:left="3600" w:hanging="360"/>
       </w:pPr>
       <w:rPr>
         <w:rFonts w:ascii="Courier New" w:hAnsi="Courier New" w:cs="Courier New" w:hint="default"/>
@@ -8004,12 +7999,12 @@
       <w:start w:val="1"/>
       <w:numFmt w:val="bullet"/>
       <w:lvlText w:val=""/>
-      <w:lvlJc w:val="start"/>
+      <w:lvlJc w:val="left"/>
       <w:pPr>
         <w:tabs>
           <w:tab w:val="num" w:pos="0"/>
         </w:tabs>
-        <w:ind w:start="4320" w:hanging="360"/>
+        <w:ind w:left="4320" w:hanging="360"/>
       </w:pPr>
       <w:rPr>
         <w:rFonts w:ascii="Wingdings" w:hAnsi="Wingdings" w:cs="Wingdings" w:hint="default"/>
@@ -8019,12 +8014,12 @@
       <w:start w:val="1"/>
       <w:numFmt w:val="bullet"/>
       <w:lvlText w:val=""/>
-      <w:lvlJc w:val="start"/>
+      <w:lvlJc w:val="left"/>
       <w:pPr>
         <w:tabs>
           <w:tab w:val="num" w:pos="0"/>
         </w:tabs>
-        <w:ind w:start="5040" w:hanging="360"/>
+        <w:ind w:left="5040" w:hanging="360"/>
       </w:pPr>
       <w:rPr>
         <w:rFonts w:ascii="Symbol" w:hAnsi="Symbol" w:cs="Symbol" w:hint="default"/>
@@ -8034,12 +8029,12 @@
       <w:start w:val="1"/>
       <w:numFmt w:val="bullet"/>
       <w:lvlText w:val="o"/>
-      <w:lvlJc w:val="start"/>
+      <w:lvlJc w:val="left"/>
       <w:pPr>
         <w:tabs>
           <w:tab w:val="num" w:pos="0"/>
         </w:tabs>
-        <w:ind w:start="5760" w:hanging="360"/>
+        <w:ind w:left="5760" w:hanging="360"/>
       </w:pPr>
       <w:rPr>
         <w:rFonts w:ascii="Courier New" w:hAnsi="Courier New" w:cs="Courier New" w:hint="default"/>
@@ -8049,12 +8044,12 @@
       <w:start w:val="1"/>
       <w:numFmt w:val="bullet"/>
       <w:lvlText w:val=""/>
-      <w:lvlJc w:val="start"/>
+      <w:lvlJc w:val="left"/>
       <w:pPr>
         <w:tabs>
           <w:tab w:val="num" w:pos="0"/>
         </w:tabs>
-        <w:ind w:start="6480" w:hanging="360"/>
+        <w:ind w:left="6480" w:hanging="360"/>
       </w:pPr>
       <w:rPr>
         <w:rFonts w:ascii="Wingdings" w:hAnsi="Wingdings" w:cs="Wingdings" w:hint="default"/>
@@ -8066,12 +8061,12 @@
       <w:start w:val="1"/>
       <w:numFmt w:val="bullet"/>
       <w:lvlText w:val=""/>
-      <w:lvlJc w:val="start"/>
+      <w:lvlJc w:val="left"/>
       <w:pPr>
         <w:tabs>
           <w:tab w:val="num" w:pos="0"/>
         </w:tabs>
-        <w:ind w:start="720" w:hanging="360"/>
+        <w:ind w:left="720" w:hanging="360"/>
       </w:pPr>
       <w:rPr>
         <w:rFonts w:ascii="Symbol" w:hAnsi="Symbol" w:cs="Symbol" w:hint="default"/>
@@ -8081,12 +8076,12 @@
       <w:start w:val="1"/>
       <w:numFmt w:val="bullet"/>
       <w:lvlText w:val="o"/>
-      <w:lvlJc w:val="start"/>
+      <w:lvlJc w:val="left"/>
       <w:pPr>
         <w:tabs>
           <w:tab w:val="num" w:pos="0"/>
         </w:tabs>
-        <w:ind w:start="1440" w:hanging="360"/>
+        <w:ind w:left="1440" w:hanging="360"/>
       </w:pPr>
       <w:rPr>
         <w:rFonts w:ascii="Courier New" w:hAnsi="Courier New" w:cs="Courier New" w:hint="default"/>
@@ -8096,12 +8091,12 @@
       <w:start w:val="1"/>
       <w:numFmt w:val="bullet"/>
       <w:lvlText w:val=""/>
-      <w:lvlJc w:val="start"/>
+      <w:lvlJc w:val="left"/>
       <w:pPr>
         <w:tabs>
           <w:tab w:val="num" w:pos="0"/>
         </w:tabs>
-        <w:ind w:start="2160" w:hanging="360"/>
+        <w:ind w:left="2160" w:hanging="360"/>
       </w:pPr>
       <w:rPr>
         <w:rFonts w:ascii="Wingdings" w:hAnsi="Wingdings" w:cs="Wingdings" w:hint="default"/>
@@ -8111,12 +8106,12 @@
       <w:start w:val="1"/>
       <w:numFmt w:val="bullet"/>
       <w:lvlText w:val=""/>
-      <w:lvlJc w:val="start"/>
+      <w:lvlJc w:val="left"/>
       <w:pPr>
         <w:tabs>
           <w:tab w:val="num" w:pos="0"/>
         </w:tabs>
-        <w:ind w:start="2880" w:hanging="360"/>
+        <w:ind w:left="2880" w:hanging="360"/>
       </w:pPr>
       <w:rPr>
         <w:rFonts w:ascii="Symbol" w:hAnsi="Symbol" w:cs="Symbol" w:hint="default"/>
@@ -8126,12 +8121,12 @@
       <w:start w:val="1"/>
       <w:numFmt w:val="bullet"/>
       <w:lvlText w:val="o"/>
-      <w:lvlJc w:val="start"/>
+      <w:lvlJc w:val="left"/>
       <w:pPr>
         <w:tabs>
           <w:tab w:val="num" w:pos="0"/>
         </w:tabs>
-        <w:ind w:start="3600" w:hanging="360"/>
+        <w:ind w:left="3600" w:hanging="360"/>
       </w:pPr>
       <w:rPr>
         <w:rFonts w:ascii="Courier New" w:hAnsi="Courier New" w:cs="Courier New" w:hint="default"/>
@@ -8141,12 +8136,12 @@
       <w:start w:val="1"/>
       <w:numFmt w:val="bullet"/>
       <w:lvlText w:val=""/>
-      <w:lvlJc w:val="start"/>
+      <w:lvlJc w:val="left"/>
       <w:pPr>
         <w:tabs>
           <w:tab w:val="num" w:pos="0"/>
         </w:tabs>
-        <w:ind w:start="4320" w:hanging="360"/>
+        <w:ind w:left="4320" w:hanging="360"/>
       </w:pPr>
       <w:rPr>
         <w:rFonts w:ascii="Wingdings" w:hAnsi="Wingdings" w:cs="Wingdings" w:hint="default"/>
@@ -8156,12 +8151,12 @@
       <w:start w:val="1"/>
       <w:numFmt w:val="bullet"/>
       <w:lvlText w:val=""/>
-      <w:lvlJc w:val="start"/>
+      <w:lvlJc w:val="left"/>
       <w:pPr>
         <w:tabs>
           <w:tab w:val="num" w:pos="0"/>
         </w:tabs>
-        <w:ind w:start="5040" w:hanging="360"/>
+        <w:ind w:left="5040" w:hanging="360"/>
       </w:pPr>
       <w:rPr>
         <w:rFonts w:ascii="Symbol" w:hAnsi="Symbol" w:cs="Symbol" w:hint="default"/>
@@ -8171,12 +8166,12 @@
       <w:start w:val="1"/>
       <w:numFmt w:val="bullet"/>
       <w:lvlText w:val="o"/>
-      <w:lvlJc w:val="start"/>
+      <w:lvlJc w:val="left"/>
       <w:pPr>
         <w:tabs>
           <w:tab w:val="num" w:pos="0"/>
         </w:tabs>
-        <w:ind w:start="5760" w:hanging="360"/>
+        <w:ind w:left="5760" w:hanging="360"/>
       </w:pPr>
       <w:rPr>
         <w:rFonts w:ascii="Courier New" w:hAnsi="Courier New" w:cs="Courier New" w:hint="default"/>
@@ -8186,12 +8181,12 @@
       <w:start w:val="1"/>
       <w:numFmt w:val="bullet"/>
       <w:lvlText w:val=""/>
-      <w:lvlJc w:val="start"/>
+      <w:lvlJc w:val="left"/>
       <w:pPr>
         <w:tabs>
           <w:tab w:val="num" w:pos="0"/>
         </w:tabs>
-        <w:ind w:start="6480" w:hanging="360"/>
+        <w:ind w:left="6480" w:hanging="360"/>
       </w:pPr>
       <w:rPr>
         <w:rFonts w:ascii="Wingdings" w:hAnsi="Wingdings" w:cs="Wingdings" w:hint="default"/>
@@ -8203,12 +8198,12 @@
       <w:start w:val="1"/>
       <w:numFmt w:val="bullet"/>
       <w:lvlText w:val=""/>
-      <w:lvlJc w:val="start"/>
+      <w:lvlJc w:val="left"/>
       <w:pPr>
         <w:tabs>
           <w:tab w:val="num" w:pos="0"/>
         </w:tabs>
-        <w:ind w:start="720" w:hanging="360"/>
+        <w:ind w:left="720" w:hanging="360"/>
       </w:pPr>
       <w:rPr>
         <w:rFonts w:ascii="Symbol" w:hAnsi="Symbol" w:cs="Symbol" w:hint="default"/>
@@ -8218,12 +8213,12 @@
       <w:start w:val="1"/>
       <w:numFmt w:val="bullet"/>
       <w:lvlText w:val="o"/>
-      <w:lvlJc w:val="start"/>
+      <w:lvlJc w:val="left"/>
       <w:pPr>
         <w:tabs>
           <w:tab w:val="num" w:pos="0"/>
         </w:tabs>
-        <w:ind w:start="1440" w:hanging="360"/>
+        <w:ind w:left="1440" w:hanging="360"/>
       </w:pPr>
       <w:rPr>
         <w:rFonts w:ascii="Courier New" w:hAnsi="Courier New" w:cs="Courier New" w:hint="default"/>
@@ -8233,12 +8228,12 @@
       <w:start w:val="1"/>
       <w:numFmt w:val="bullet"/>
       <w:lvlText w:val=""/>
-      <w:lvlJc w:val="start"/>
+      <w:lvlJc w:val="left"/>
       <w:pPr>
         <w:tabs>
           <w:tab w:val="num" w:pos="0"/>
         </w:tabs>
-        <w:ind w:start="2160" w:hanging="360"/>
+        <w:ind w:left="2160" w:hanging="360"/>
       </w:pPr>
       <w:rPr>
         <w:rFonts w:ascii="Wingdings" w:hAnsi="Wingdings" w:cs="Wingdings" w:hint="default"/>
@@ -8248,12 +8243,12 @@
       <w:start w:val="1"/>
       <w:numFmt w:val="bullet"/>
       <w:lvlText w:val=""/>
-      <w:lvlJc w:val="start"/>
+      <w:lvlJc w:val="left"/>
       <w:pPr>
         <w:tabs>
           <w:tab w:val="num" w:pos="0"/>
         </w:tabs>
-        <w:ind w:start="2880" w:hanging="360"/>
+        <w:ind w:left="2880" w:hanging="360"/>
       </w:pPr>
       <w:rPr>
         <w:rFonts w:ascii="Symbol" w:hAnsi="Symbol" w:cs="Symbol" w:hint="default"/>
@@ -8263,12 +8258,12 @@
       <w:start w:val="1"/>
       <w:numFmt w:val="bullet"/>
       <w:lvlText w:val="o"/>
-      <w:lvlJc w:val="start"/>
+      <w:lvlJc w:val="left"/>
       <w:pPr>
         <w:tabs>
           <w:tab w:val="num" w:pos="0"/>
         </w:tabs>
-        <w:ind w:start="3600" w:hanging="360"/>
+        <w:ind w:left="3600" w:hanging="360"/>
       </w:pPr>
       <w:rPr>
         <w:rFonts w:ascii="Courier New" w:hAnsi="Courier New" w:cs="Courier New" w:hint="default"/>
@@ -8278,12 +8273,12 @@
       <w:start w:val="1"/>
       <w:numFmt w:val="bullet"/>
       <w:lvlText w:val=""/>
-      <w:lvlJc w:val="start"/>
+      <w:lvlJc w:val="left"/>
       <w:pPr>
         <w:tabs>
           <w:tab w:val="num" w:pos="0"/>
         </w:tabs>
-        <w:ind w:start="4320" w:hanging="360"/>
+        <w:ind w:left="4320" w:hanging="360"/>
       </w:pPr>
       <w:rPr>
         <w:rFonts w:ascii="Wingdings" w:hAnsi="Wingdings" w:cs="Wingdings" w:hint="default"/>
@@ -8293,12 +8288,12 @@
       <w:start w:val="1"/>
       <w:numFmt w:val="bullet"/>
       <w:lvlText w:val=""/>
-      <w:lvlJc w:val="start"/>
+      <w:lvlJc w:val="left"/>
       <w:pPr>
         <w:tabs>
           <w:tab w:val="num" w:pos="0"/>
         </w:tabs>
-        <w:ind w:start="5040" w:hanging="360"/>
+        <w:ind w:left="5040" w:hanging="360"/>
       </w:pPr>
       <w:rPr>
         <w:rFonts w:ascii="Symbol" w:hAnsi="Symbol" w:cs="Symbol" w:hint="default"/>
@@ -8308,12 +8303,12 @@
       <w:start w:val="1"/>
       <w:numFmt w:val="bullet"/>
       <w:lvlText w:val="o"/>
-      <w:lvlJc w:val="start"/>
+      <w:lvlJc w:val="left"/>
       <w:pPr>
         <w:tabs>
           <w:tab w:val="num" w:pos="0"/>
         </w:tabs>
-        <w:ind w:start="5760" w:hanging="360"/>
+        <w:ind w:left="5760" w:hanging="360"/>
       </w:pPr>
       <w:rPr>
         <w:rFonts w:ascii="Courier New" w:hAnsi="Courier New" w:cs="Courier New" w:hint="default"/>
@@ -8323,12 +8318,12 @@
       <w:start w:val="1"/>
       <w:numFmt w:val="bullet"/>
       <w:lvlText w:val=""/>
-      <w:lvlJc w:val="start"/>
+      <w:lvlJc w:val="left"/>
       <w:pPr>
         <w:tabs>
           <w:tab w:val="num" w:pos="0"/>
         </w:tabs>
-        <w:ind w:start="6480" w:hanging="360"/>
+        <w:ind w:left="6480" w:hanging="360"/>
       </w:pPr>
       <w:rPr>
         <w:rFonts w:ascii="Wingdings" w:hAnsi="Wingdings" w:cs="Wingdings" w:hint="default"/>
@@ -8341,12 +8336,12 @@
       <w:numFmt w:val="none"/>
       <w:suff w:val="nothing"/>
       <w:lvlText w:val=""/>
-      <w:lvlJc w:val="start"/>
+      <w:lvlJc w:val="left"/>
       <w:pPr>
         <w:tabs>
           <w:tab w:val="num" w:pos="0"/>
         </w:tabs>
-        <w:ind w:start="0" w:hanging="0"/>
+        <w:ind w:left="0" w:hanging="0"/>
       </w:pPr>
     </w:lvl>
     <w:lvl w:ilvl="1">
@@ -8354,12 +8349,12 @@
       <w:numFmt w:val="none"/>
       <w:suff w:val="nothing"/>
       <w:lvlText w:val=""/>
-      <w:lvlJc w:val="start"/>
+      <w:lvlJc w:val="left"/>
       <w:pPr>
         <w:tabs>
           <w:tab w:val="num" w:pos="0"/>
         </w:tabs>
-        <w:ind w:start="0" w:hanging="0"/>
+        <w:ind w:left="0" w:hanging="0"/>
       </w:pPr>
     </w:lvl>
     <w:lvl w:ilvl="2">
@@ -8367,12 +8362,12 @@
       <w:numFmt w:val="none"/>
       <w:suff w:val="nothing"/>
       <w:lvlText w:val=""/>
-      <w:lvlJc w:val="start"/>
+      <w:lvlJc w:val="left"/>
       <w:pPr>
         <w:tabs>
           <w:tab w:val="num" w:pos="0"/>
         </w:tabs>
-        <w:ind w:start="0" w:hanging="0"/>
+        <w:ind w:left="0" w:hanging="0"/>
       </w:pPr>
     </w:lvl>
     <w:lvl w:ilvl="3">
@@ -8380,12 +8375,12 @@
       <w:numFmt w:val="none"/>
       <w:suff w:val="nothing"/>
       <w:lvlText w:val=""/>
-      <w:lvlJc w:val="start"/>
+      <w:lvlJc w:val="left"/>
       <w:pPr>
         <w:tabs>
           <w:tab w:val="num" w:pos="0"/>
         </w:tabs>
-        <w:ind w:start="0" w:hanging="0"/>
+        <w:ind w:left="0" w:hanging="0"/>
       </w:pPr>
     </w:lvl>
     <w:lvl w:ilvl="4">
@@ -8393,12 +8388,12 @@
       <w:numFmt w:val="none"/>
       <w:suff w:val="nothing"/>
       <w:lvlText w:val=""/>
-      <w:lvlJc w:val="start"/>
+      <w:lvlJc w:val="left"/>
       <w:pPr>
         <w:tabs>
           <w:tab w:val="num" w:pos="0"/>
         </w:tabs>
-        <w:ind w:start="0" w:hanging="0"/>
+        <w:ind w:left="0" w:hanging="0"/>
       </w:pPr>
     </w:lvl>
     <w:lvl w:ilvl="5">
@@ -8406,12 +8401,12 @@
       <w:numFmt w:val="none"/>
       <w:suff w:val="nothing"/>
       <w:lvlText w:val=""/>
-      <w:lvlJc w:val="start"/>
+      <w:lvlJc w:val="left"/>
       <w:pPr>
         <w:tabs>
           <w:tab w:val="num" w:pos="0"/>
         </w:tabs>
-        <w:ind w:start="0" w:hanging="0"/>
+        <w:ind w:left="0" w:hanging="0"/>
       </w:pPr>
     </w:lvl>
     <w:lvl w:ilvl="6">
@@ -8419,12 +8414,12 @@
       <w:numFmt w:val="none"/>
       <w:suff w:val="nothing"/>
       <w:lvlText w:val=""/>
-      <w:lvlJc w:val="start"/>
+      <w:lvlJc w:val="left"/>
       <w:pPr>
         <w:tabs>
           <w:tab w:val="num" w:pos="0"/>
         </w:tabs>
-        <w:ind w:start="0" w:hanging="0"/>
+        <w:ind w:left="0" w:hanging="0"/>
       </w:pPr>
     </w:lvl>
     <w:lvl w:ilvl="7">
@@ -8432,12 +8427,12 @@
       <w:numFmt w:val="none"/>
       <w:suff w:val="nothing"/>
       <w:lvlText w:val=""/>
-      <w:lvlJc w:val="start"/>
+      <w:lvlJc w:val="left"/>
       <w:pPr>
         <w:tabs>
           <w:tab w:val="num" w:pos="0"/>
         </w:tabs>
-        <w:ind w:start="0" w:hanging="0"/>
+        <w:ind w:left="0" w:hanging="0"/>
       </w:pPr>
     </w:lvl>
     <w:lvl w:ilvl="8">
@@ -8445,12 +8440,12 @@
       <w:numFmt w:val="none"/>
       <w:suff w:val="nothing"/>
       <w:lvlText w:val=""/>
-      <w:lvlJc w:val="start"/>
+      <w:lvlJc w:val="left"/>
       <w:pPr>
         <w:tabs>
           <w:tab w:val="num" w:pos="0"/>
         </w:tabs>
-        <w:ind w:start="0" w:hanging="0"/>
+        <w:ind w:left="0" w:hanging="0"/>
       </w:pPr>
     </w:lvl>
   </w:abstractNum>
@@ -8880,7 +8875,7 @@
       <w:suppressAutoHyphens w:val="true"/>
       <w:bidi w:val="0"/>
       <w:spacing w:lineRule="auto" w:line="259" w:before="0" w:after="160"/>
-      <w:jc w:val="start"/>
+      <w:jc w:val="left"/>
     </w:pPr>
     <w:rPr>
       <w:rFonts w:ascii="Calibri" w:hAnsi="Calibri" w:eastAsia="Calibri" w:cs="" w:asciiTheme="minorHAnsi" w:cstheme="minorBidi" w:eastAsiaTheme="minorHAnsi" w:hAnsiTheme="minorHAnsi"/>
@@ -9016,13 +9011,13 @@
       <w:lang w:val="pl-PL"/>
     </w:rPr>
   </w:style>
-  <w:style w:type="character" w:styleId="czeindeksu">
-    <w:name w:val="Łącze indeksu"/>
+  <w:style w:type="character" w:styleId="czeindeksuuser">
+    <w:name w:val="Łącze indeksu (user)"/>
     <w:qFormat/>
     <w:rPr/>
   </w:style>
-  <w:style w:type="character" w:styleId="czeindeksuuser">
-    <w:name w:val="Łącze indeksu (user)"/>
+  <w:style w:type="character" w:styleId="czeindeksu">
+    <w:name w:val="Łącze indeksu"/>
     <w:qFormat/>
     <w:rPr/>
   </w:style>
@@ -9110,15 +9105,15 @@
       <w:rFonts w:cs="Arial"/>
     </w:rPr>
   </w:style>
-  <w:style w:type="paragraph" w:styleId="Gwkaistopka">
-    <w:name w:val="Główka i stopka"/>
+  <w:style w:type="paragraph" w:styleId="Gwkaistopkauser">
+    <w:name w:val="Główka i stopka (user)"/>
     <w:basedOn w:val="Normal"/>
     <w:qFormat/>
     <w:pPr/>
     <w:rPr/>
   </w:style>
-  <w:style w:type="paragraph" w:styleId="Gwkaistopkauser">
-    <w:name w:val="Główka i stopka (user)"/>
+  <w:style w:type="paragraph" w:styleId="Gwkaistopka">
+    <w:name w:val="Główka i stopka"/>
     <w:basedOn w:val="Normal"/>
     <w:qFormat/>
     <w:pPr/>
@@ -9206,7 +9201,7 @@
     <w:rsid w:val="00ed2828"/>
     <w:pPr>
       <w:spacing w:before="0" w:after="160"/>
-      <w:ind w:start="720"/>
+      <w:ind w:left="720"/>
       <w:contextualSpacing/>
     </w:pPr>
     <w:rPr/>
@@ -9223,7 +9218,7 @@
       </w:pBdr>
       <w:shd w:val="clear" w:color="auto" w:fill="F2F2F2" w:themeFill="background1" w:themeFillShade="f2"/>
       <w:spacing w:before="240" w:after="240"/>
-      <w:ind w:start="284"/>
+      <w:ind w:left="284"/>
       <w:contextualSpacing/>
     </w:pPr>
     <w:rPr>
@@ -9283,8 +9278,8 @@
       <w:lang w:val="pl-PL"/>
     </w:rPr>
   </w:style>
-  <w:style w:type="numbering" w:styleId="Bezlisty" w:default="1">
-    <w:name w:val="Bez listy"/>
+  <w:style w:type="numbering" w:styleId="Bezlistyuser" w:default="1">
+    <w:name w:val="Bez listy (user)"/>
     <w:uiPriority w:val="99"/>
     <w:semiHidden/>
     <w:unhideWhenUsed/>

</xml_diff>